<commit_message>
RSL alinhada à proposta: referencial externo ao corpus explicitado, Buckingham e Ball com páginas, transições suavizadas e referências em ABNT
Co-Authored-By: Claude Opus 5.5 <noreply@anthropic.com>
Claude-Session: https://claude.ai/code/session_01HxStpW4pQoDfJdTDYr6zEC
</commit_message>
<xml_diff>
--- a/rsl_nova/2_RSL_alinhada_ao_projeto.docx
+++ b/rsl_nova/2_RSL_alinhada_ao_projeto.docx
@@ -269,7 +269,7 @@
         <w:rPr>
           <w:rtl w:val="0"/>
         </w:rPr>
-        <w:t xml:space="preserve">A RSL permite, assim, avaliar criticamente as afirmações da literatura sobre educação digital e mostrar as lacunas das quais a pesquisa de campo se ocupará.</w:t>
+        <w:t xml:space="preserve">Com a RSL, as afirmações da literatura sobre educação digital podem ser avaliadas criticamente, e as lacunas de que a pesquisa de campo se ocupará ficam à vista.</w:t>
       </w:r>
     </w:p>
     <w:p>
@@ -1089,7 +1089,7 @@
         <w:rPr>
           <w:rtl w:val="0"/>
         </w:rPr>
-        <w:t>Cidadania digital nomeia a parte formativa que junta uso, direitos e responsabilidade em ambientes conectados. Aplicada aos anos iniciais, a noção esbarra em um pressuposto que a literatura crítica desmontou. A ideia de nativo digital, formulada por Prensky (2001), sustenta que a familiaridade das crianças com dispositivos produziria, por si, competência para usá-los com senso crítico. Buckingham (2006) mostra que a exposição precoce a artefatos digitais só se converte em leitura crítica com mediação formativa deliberada. Estudar crianças conectadas, portanto, é diferente de estudar cidadania digital.</w:t>
+        <w:t xml:space="preserve">Cidadania digital nomeia a parte formativa que junta uso, direitos e responsabilidade em ambientes conectados. Aplicada aos anos iniciais, a noção esbarra em um pressuposto que a literatura crítica desmontou. A ideia de nativo digital, formulada por Prensky (2001), sustenta que a familiaridade das crianças com dispositivos produziria, por si, competência para usá-los com senso crítico. Buckingham (2006, p. 39) contesta essa ideia ao lembrar que “as crianças não sabem ‘naturalmente’ como usar computadores: como os adultos, muitas vezes elas experimentam confusão, tédio e frustração”. A exposição precoce a artefatos digitais, lida com o autor, depende de mediação formativa deliberada para se converter em leitura crítica, e estudar crianças conectadas é, por isso, diferente de estudar cidadania digital.</w:t>
       </w:r>
     </w:p>
     <w:p>
@@ -13956,7 +13956,7 @@
         <w:rPr>
           <w:rtl w:val="0"/>
         </w:rPr>
-        <w:t>O território também comparece no corpus de modo restrito, como contraste entre países e regiões, sem variação interna a um mesmo sistema. Williams (2022) documenta uma restrição de escala nacional, imposta de fora do sistema educacional, e Paños-Castro, Arruti e Korres (2022) trabalham com uma comunidade autônoma dotada de programas próprios. Não encontramos estudo sobre as diferenças, dentro de um mesmo país, entre a capacidade de implementação de uma rede municipal de grande porte e a de um município pequeno. No Brasil, onde a educação básica se organiza em regime de colaboração entre entes com capacidades desiguais, essa ausência pesa na compreensão das condições territoriais de atuação das políticas de educação digital. A pesquisa TIC Educação (CETIC.br, 2024), referência externa ao corpus, dá a dimensão dessas diferenças entre escolas brasileiras. A leitura do território como dimensão constitutiva do contexto da prática, proposta nesta tese, não encontra, assim, apoio direto na literatura recuperada.</w:t>
+        <w:t xml:space="preserve">O território também comparece no corpus de modo restrito, como contraste entre países e regiões, sem variação interna a um mesmo sistema. Williams (2022) documenta uma restrição de escala nacional, imposta de fora do sistema educacional, e Paños-Castro, Arruti e Korres (2022) trabalham com uma comunidade autônoma dotada de programas próprios. Não encontramos estudo sobre as diferenças, dentro de um mesmo país, entre a capacidade de implementação de uma rede municipal de grande porte e a de um município pequeno. No Brasil, onde a educação básica se organiza em regime de colaboração entre entes com capacidades desiguais, essa ausência pesa na compreensão das condições territoriais de atuação das políticas de educação digital. A pesquisa TIC Educação (CETIC.br, 2024), referência externa ao corpus, dá a dimensão dessas diferenças entre escolas brasileiras. A leitura do território como dimensão constitutiva do contexto da prática, proposta nesta tese, não encontra apoio direto na literatura recuperada e vem de referenciais externos ao corpus. Santos (1999, p. 19) afirma que “o território não é uma categoria de análise, a categoria de análise é o território usado”, e Massey (2008, p. 29) compreende o espaço “como a esfera na qual distintas trajetórias coexistem”, formulações que permitem ler também as desigualdades internas a um mesmo distrito.</w:t>
       </w:r>
     </w:p>
     <w:p>
@@ -14081,7 +14081,7 @@
         <w:rPr>
           <w:rtl w:val="0"/>
         </w:rPr>
-        <w:t>Há, ainda, um limite mais importante no tratamento desse papel pelo corpus, com efeito sobre o desenho desta tese. Os estudos investigam a mediação profissional sobretudo em sua relação com os resultados ou com as formas assumidas pela política na escola e examinam pouco a experiência de quem a produz e as razões que a orientam. O que leva um profissional a interpretar uma diretriz de um modo e não de outro, as negociações que estabelece entre o que a norma pede e o que a escola comporta e o sentido que atribui a esse trabalho aparecem pouco, e às vezes nem aparecem. Reconhecida a centralidade da interpretação profissional, as condições em que ela se produz recebem exame menos denso. Interpretar, aqui, significa decidir dentro de limites, pois os profissionais da educação ajustam suas ações diante das prescrições e das condições encontradas, sem autonomia irrestrita sobre os rumos da política, e decidem dentro de regras, recursos, tempos, responsabilidades institucionais e demandas concorrentes. Faltam ao corpus, sobretudo, duas dimensões. A primeira são as culturas profissionais, isto é, as crenças, os valores, os hábitos e as formas de relação entre os profissionais que filtram o que a política pede (HARGREAVES, 2005). A segunda são as pressões por resultados, que podem levar a escola a produzir registros e evidências de uma política que não encontrou condições para acontecer (BALL, 2004). Nenhum dos estudos, além disso, separa a situação em que o profissional trabalha com um recurso existente daquela em que trabalha a partir de uma condição ausente, seja o equipamento, a conexão ou a formação que a política anunciou. Essas dimensões compõem a tese de partida, apresentada na seção 1.5 da Introdução, cujos critérios de leitura definimos no Capítulo 4.</w:t>
+        <w:t xml:space="preserve">Há, ainda, um limite mais importante no tratamento desse papel pelo corpus, com efeito sobre o desenho desta tese. Os estudos investigam a mediação profissional sobretudo em sua relação com os resultados ou com as formas assumidas pela política na escola e examinam pouco a experiência de quem a produz e as razões que a orientam. Aparecem pouco, e às vezes nem aparecem, os motivos que levam um profissional a interpretar uma diretriz de certo modo, as negociações que estabelece entre o que a norma pede e o que a escola comporta e o sentido que atribui a esse trabalho. Reconhecida a centralidade da interpretação profissional, as condições em que ela se produz recebem exame menos denso. Interpretar, aqui, significa decidir dentro de limites. Ball, Maguire e Braun (2016, p. 14) lembram que as políticas “raramente ditam ou determinam a prática, mas algumas mais do que outras estreitam a gama de respostas criativas”, e Ball (2011, p. 45-46) acrescenta que elas “criam circunstâncias nas quais o espectro de opções disponíveis sobre o que fazer é reduzido ou modificado”, de modo que “uma resposta ainda precisa ser construída no contexto”. Faltam ao corpus, sobretudo, duas dimensões. A primeira são as culturas profissionais, que Hargreaves (2005, p. 189, tradução nossa) define como “crenças, valores, hábitos e formas de fazer as coisas assumidas pelas comunidades de professores que têm de enfrentar exigências e limitações semelhantes ao longo de muitos anos”, e que filtram o que a política pede. A segunda são as pressões por resultados, que podem levar a escola a produzir registros e evidências de uma política que não encontrou condições para acontecer, situação que Ball (2004) descreve com a noção de performatividade e Ball (2002), com a de fabricação. Nenhum dos estudos, além disso, separa a situação em que o profissional trabalha com um recurso existente daquela em que trabalha a partir de uma condição ausente, seja o equipamento, a conexão ou a formação que a política anunciou. Essas dimensões compõem a tese de partida, apresentada na seção 1.5 da Introdução, cujos critérios de leitura definimos no Capítulo 4.</w:t>
       </w:r>
     </w:p>
     <w:p>
@@ -14122,55 +14122,7 @@
         <w:rPr>
           <w:rtl w:val="0"/>
         </w:rPr>
-        <w:t xml:space="preserve">A terceira subpergunta tem menos apoio no corpus do que as duas anteriores. Esse desequilíbrio já é, em si, um resultado da revisão, em contraste com o peso dado pela política ao tema: a PNED</w:t>
-      </w:r>
-      <w:r>
-        <w:rPr>
-          <w:rtl w:val="0"/>
-        </w:rPr>
-        <w:t xml:space="preserve">, como vimos na Introdução,</w:t>
-      </w:r>
-      <w:r>
-        <w:rPr>
-          <w:rtl w:val="0"/>
-        </w:rPr>
-        <w:t xml:space="preserve"> associa a cultura digital à </w:t>
-      </w:r>
-      <w:r>
-        <w:rPr>
-          <w:rtl w:val="0"/>
-        </w:rPr>
-        <w:t xml:space="preserve">participação consciente e democrática por meio das tecnologias </w:t>
-      </w:r>
-      <w:r>
-        <w:rPr>
-          <w:rtl w:val="0"/>
-        </w:rPr>
-        <w:t xml:space="preserve">e os direitos digitais à </w:t>
-      </w:r>
-      <w:r>
-        <w:rPr>
-          <w:rtl w:val="0"/>
-        </w:rPr>
-        <w:t xml:space="preserve">proteção dos dados de crianças e adolescentes</w:t>
-      </w:r>
-      <w:r>
-        <w:rPr>
-          <w:rtl w:val="0"/>
-        </w:rPr>
-        <w:t xml:space="preserve"> (BRASIL, 2023, art. 3º, III e IV). Nos </w:t>
-      </w:r>
-      <w:r>
-        <w:rPr>
-          <w:rtl w:val="0"/>
-        </w:rPr>
-        <w:t xml:space="preserve">anos iniciais, e sobretudo no 1º e no 2º ano</w:t>
-      </w:r>
-      <w:r>
-        <w:rPr>
-          <w:rtl w:val="0"/>
-        </w:rPr>
-        <w:t xml:space="preserve">, as crianças acabam de ingressar na escolarização obrigatória, e, como vimos com Buckingham na seção 2.1.1, a familiaridade com dispositivos não basta para formar leitores críticos do mundo digital. O modo como o eixo chega à sala de aula decide se essa formação acontece, e sobre isso a literatura encontrada diz pouco.</w:t>
+        <w:t xml:space="preserve">A terceira subpergunta tem menos apoio no corpus do que as duas anteriores, e esse desequilíbrio é um resultado da revisão, que contrasta com o peso dado pela política ao tema: a PNED, como vimos na Introdução, associa a cultura digital à participação consciente e democrática por meio das tecnologias e os direitos digitais à proteção dos dados de crianças e adolescentes (BRASIL, 2023, art. 3º, III e IV). Nos anos iniciais, e sobretudo no 1º e no 2º ano, as crianças acabam de ingressar na escolarização obrigatória, e, como vimos com Buckingham na seção 2.1.1, a familiaridade com dispositivos não basta para formar leitores críticos do mundo digital. O modo como o eixo chega à sala de aula decide se essa formação acontece, e sobre isso a literatura encontrada diz pouco.</w:t>
       </w:r>
     </w:p>
     <w:p>
@@ -15407,13 +15359,7 @@
         <w:rPr>
           <w:rtl w:val="0"/>
         </w:rPr>
-        <w:t xml:space="preserve">O percurso da revisão produziu resultados de dois tipos: os achados dos nove estudos do corpus final e o que se depreende do registro das exclusões e das ausências identificadas nesse conjunto. Nas seções seguintes, reunimos esses resultados, a começar pelas respostas às perguntas da RSL</w:t>
-      </w:r>
-      <w:r>
-        <w:rPr>
-          <w:rtl w:val="0"/>
-        </w:rPr>
-        <w:t xml:space="preserve">.</w:t>
+        <w:t xml:space="preserve">A revisão produziu resultados de dois tipos, os achados dos nove estudos do corpus final e o que se depreende do registro das exclusões e das ausências identificadas nesse conjunto. As respostas às perguntas da RSL vêm primeiro, cada uma com a indicação de até onde a afirmação vai, e as lacunas, depois.</w:t>
       </w:r>
     </w:p>
     <w:p>
@@ -15454,20 +15400,6 @@
         <w:rPr>
           <w:rtl w:val="0"/>
         </w:rPr>
-        <w:t xml:space="preserve">Nas respostas a seguir, reunimos os achados dos três eixos e dizemos, em cada caso, até onde a afirmação vai. Só depois tratamos do que falta.</w:t>
-      </w:r>
-    </w:p>
-    <w:p>
-      <w:pPr>
-        <w:spacing w:after="0" w:before="0" w:lineRule="auto"/>
-        <w:ind w:firstLine="700"/>
-        <w:jc w:val="both"/>
-        <w:rPr/>
-      </w:pPr>
-      <w:r>
-        <w:rPr>
-          <w:rtl w:val="0"/>
-        </w:rPr>
         <w:t xml:space="preserve">À subpergunta (a), o corpus responde de modo convergente quanto às condições institucionais e materiais. Além dos equipamentos e da conectividade, pesam a existência de ações formativas continuadas e situadas, a estabilidade das equipes e do suporte, o tempo de trabalho disponível e o marco regulatório que autoriza ou restringe determinadas práticas. O caso de Luxemburgo, examinado por Ivanishchenko, Busana e Reuter (2024), é o mais nítido quanto ao limite da provisão. Brown et al. (2021) acrescentam um condicionante pouco examinado, o da própria norma como fonte de restrição, pois documentam orientações oficiais que delimitaram as práticas pedagogicamente possíveis durante o fechamento das escolas.</w:t>
       </w:r>
     </w:p>
@@ -15593,7 +15525,7 @@
         <w:rPr>
           <w:rtl w:val="0"/>
         </w:rPr>
-        <w:t>As lacunas a seguir derivam do corpus e do registro das exclusões, e cada uma vem acompanhada da evidência que a sustenta, a começar pela ausência mais evidente.</w:t>
+        <w:t>Nenhum dos nove estudos incluídos examina a PNED. A política comparece em trabalhos brasileiros recuperados pela busca, mas esses estudos não atenderam aos critérios de nível de ensino ou de objeto e integram, por isso, a literatura de contextualização. A ausência tem explicação cronológica. A lei foi promulgada em janeiro de 2023. A educação digital passou a integrar o currículo do ensino fundamental pelo § 11 do art. 26 da LDB, incluído pela própria Lei nº 14.533/2023 e promulgado em dezembro de 2023, após a derrubada do veto. A Resolução CNE/CEB nº 2/2025, por fim, tornou obrigatória a implementação curricular a partir de 2026 (BRASIL, 2025, art. 36). Com as buscas encerradas em setembro de 2026, era esperado que a produção disponível não contivesse exames empíricos da atuação do eixo Educação Digital Escolar nas escolas, pois essa atuação apenas começava. A lacuna da literatura acompanha, nesse ponto, o calendário da política. É aqui que se situa a dimensão empírico-temporal do ineditismo desta tese, que decorre da novidade da norma e de um recorte fora do alcance do corpus, os anos iniciais de uma escola de rede municipal de pequeno porte.</w:t>
       </w:r>
     </w:p>
     <w:p>
@@ -15607,7 +15539,7 @@
         <w:rPr>
           <w:rtl w:val="0"/>
         </w:rPr>
-        <w:t>Nenhum dos nove estudos incluídos examina a PNED. A política comparece em trabalhos brasileiros recuperados pela busca, mas esses estudos não atenderam aos critérios de nível de ensino ou de objeto e integram, por isso, a literatura de contextualização. A ausência tem explicação cronológica. A lei foi promulgada em janeiro de 2023. A educação digital passou a integrar o currículo do ensino fundamental pelo § 11 do art. 26 da LDB, incluído pela própria Lei nº 14.533/2023 e promulgado em dezembro de 2023, após a derrubada do veto. A Resolução CNE/CEB nº 2/2025, por fim, tornou obrigatória a implementação curricular a partir de 2026 (BRASIL, 2025, art. 36). Com as buscas encerradas em setembro de 2026, era esperado que a produção disponível não contivesse exames empíricos da atuação do eixo Educação Digital Escolar nas escolas, pois essa atuação apenas começava. A lacuna da literatura acompanha, nesse ponto, o calendário da política. É aqui que se situa a dimensão empírico-temporal do ineditismo desta tese, que decorre da novidade da norma e de um recorte fora do alcance do corpus, os anos iniciais de uma escola de rede municipal de pequeno porte.</w:t>
+        <w:t>Os 26 relatórios excluídos na avaliação de elegibilidade mostram uma lacuna no tratamento do nível de ensino, pois sete deles foram excluídos pela impossibilidade de atribuir os achados aos anos iniciais, apesar da pertinência temática. Vários desses trabalhos examinam políticas de educação digital com rigor e com profissionais da educação como sujeitos, mas apresentam os resultados em bloco, sob a designação de educação básica ou de ensino fundamental, sem caracterizar os participantes por etapa. Nos estudos recuperados, os anos iniciais aparecem frequentemente integrados a conjuntos mais amplos, e suas especificidades se perdem nas médias, o que dificulta identificar a particularidade da implementação de uma política digital nessa etapa.</w:t>
       </w:r>
     </w:p>
     <w:p>
@@ -15621,7 +15553,7 @@
         <w:rPr>
           <w:rtl w:val="0"/>
         </w:rPr>
-        <w:t>Os 26 relatórios excluídos na avaliação de elegibilidade mostram uma lacuna no tratamento do nível de ensino, pois sete deles foram excluídos pela impossibilidade de atribuir os achados aos anos iniciais, apesar da pertinência temática. Vários desses trabalhos examinam políticas de educação digital com rigor e com profissionais da educação como sujeitos, mas apresentam os resultados em bloco, sob a designação de educação básica ou de ensino fundamental, sem caracterizar os participantes por etapa. Nos estudos recuperados, os anos iniciais aparecem frequentemente integrados a conjuntos mais amplos, e suas especificidades se perdem nas médias, o que dificulta identificar a particularidade da implementação de uma política digital nessa etapa.</w:t>
+        <w:t xml:space="preserve">Daí decorre a pouca visibilidade do ciclo de alfabetização, delimitado explicitamente como recorte apenas por Nunes (2024). A etapa de aprendizagem da leitura e da escrita, na qual a inserção de tecnologias digitais envolve questões pedagógicas específicas, permanece praticamente inexplorada como lugar de implementação de política digital. É a etapa das turmas acompanhadas no mestrado e parte do recorte desta tese, que vai do 1º ao 5º ano.</w:t>
       </w:r>
     </w:p>
     <w:p>
@@ -15635,7 +15567,7 @@
         <w:rPr>
           <w:rtl w:val="0"/>
         </w:rPr>
-        <w:t xml:space="preserve">Daí decorre a pouca visibilidade do ciclo de alfabetização, delimitado explicitamente como recorte apenas por Nunes (2024). A etapa de aprendizagem da leitura e da escrita, na qual a inserção de tecnologias digitais envolve questões pedagógicas específicas, permanece praticamente inexplorada como lugar de implementação de política digital. É a etapa das turmas acompanhadas no mestrado e parte do recorte desta tese, que vai do 1º ao 5º ano.</w:t>
+        <w:t xml:space="preserve">O contexto de produção dessa literatura também limita seu alcance. Os estudos incluídos são todos de 2021 em diante, e parte expressiva do corpus examina respostas produzidas durante a pandemia, particularmente no fechamento das escolas. Permanece pouco documentada, nesse conjunto, a atuação de políticas de educação digital em condições ordinárias de funcionamento escolar.</w:t>
       </w:r>
     </w:p>
     <w:p>
@@ -15649,21 +15581,7 @@
         <w:rPr>
           <w:rtl w:val="0"/>
         </w:rPr>
-        <w:t xml:space="preserve">O contexto de produção dessa literatura também limita seu alcance. Os estudos incluídos são todos de 2021 em diante, e parte expressiva do corpus examina respostas produzidas durante a pandemia, particularmente no fechamento das escolas. Permanece pouco documentada, nesse conjunto, a atuação de políticas de educação digital em condições ordinárias de funcionamento escolar.</w:t>
-      </w:r>
-    </w:p>
-    <w:p>
-      <w:pPr>
-        <w:spacing w:after="0" w:before="0" w:lineRule="auto"/>
-        <w:ind w:firstLine="700"/>
-        <w:jc w:val="both"/>
-        <w:rPr/>
-      </w:pPr>
-      <w:r>
-        <w:rPr>
-          <w:rtl w:val="0"/>
-        </w:rPr>
-        <w:t xml:space="preserve">Essa concentração temporal exige cautela na leitura dos achados. Parte das práticas descritas pela literatura foi produzida sob uma situação extraordinária, marcada pela necessidade de garantir continuidade às atividades escolares, e não pode ser lida, sem mais, como modo regular de pôr a educação digital em prática. Tomar a resposta emergencial como modelo seria um equívoco, e a distinção entre resposta emergencial e atuação regular da política pesa, por isso, na investigação desta tese.</w:t>
+        <w:t xml:space="preserve">Essa concentração temporal exige cautela na leitura dos achados. Parte das práticas descritas pela literatura foi produzida sob uma situação extraordinária, marcada pela necessidade de garantir continuidade às atividades escolares, e lê-las como modo regular de pôr a educação digital em prática seria um equívoco. A distinção entre resposta emergencial e atuação regular da política pesa, por isso, na investigação desta tese.</w:t>
       </w:r>
     </w:p>
     <w:p>
@@ -17227,7 +17145,7 @@
         <w:rPr>
           <w:rtl w:val="0"/>
         </w:rPr>
-        <w:t xml:space="preserve">O alcance dos achados apresentados depende de restrições metodológicas, que explicitamos a seguir conforme as recomendações de transparência do PRISMA 2020 para o relato do processo de seleção, coleta, avaliação e síntese dos estudos (PAGE et al., 2022). </w:t>
+        <w:t xml:space="preserve">O alcance dos achados depende de restrições metodológicas que o PRISMA 2020 pede que sejam explicitadas no relato do processo de seleção, coleta, avaliação e síntese dos estudos (PAGE et al., 2022).</w:t>
       </w:r>
     </w:p>
     <w:p>
@@ -17378,7 +17296,7 @@
         <w:rPr>
           <w:rtl w:val="0"/>
         </w:rPr>
-        <w:t>A dimensão teórico-conceitual está na leitura conjunta dessas condições. Tratamos a implementação como processo relacional, reunindo o normativo, o institucional, o territorial e o formativo, costumeiramente examinados em separado pela literatura. A Abordagem do Ciclo de Políticas (BOWE; BALL; GOLD, 1992) e a teoria da atuação (BALL; MAGUIRE; BRAUN, 2016), referenciais externos ao corpus desenvolvidos no Capítulo 4, oferecem as ferramentas para essa leitura conjunta. O corpus contém estudos sobre infraestrutura, formação, políticas e atuação profissional, quase sempre examinados de maneira isolada, e permanece menos explorada a relação entre essas dimensões quando uma política nacional chega a uma rede municipal e é encenada em uma escola situada em condições territoriais e institucionais específicas. Nesse ponto está o problema empírico desta tese, que diz respeito ao modo como as orientações da PNED assumem sentidos e formas de atuação ao atravessar condições materiais, institucionais e territoriais específicas e encontrar profissionais da educação que, com suas culturas profissionais, tomam decisões situadas no cotidiano escolar.</w:t>
+        <w:t xml:space="preserve">A dimensão teórico-conceitual está na leitura conjunta dessas condições. Tratamos a implementação como processo relacional, reunindo o normativo, o institucional, o territorial e o formativo, costumeiramente examinados em separado pela literatura. Os referenciais que permitem essa leitura são externos ao corpus. A Abordagem do Ciclo de Políticas (BOWE; BALL; GOLD, 1992; MAINARDES, 2006) e a teoria da atuação (BALL; MAGUIRE; BRAUN, 2016) oferecem as ferramentas para ler a política no contexto da prática; a discussão de Hargreaves (2005) sobre culturas profissionais e a de Ball (2004, 2008) sobre performatividade permitem examinar o que filtra e o que pressiona a atuação; e as leituras de território de Santos (1999, 2006) e de Massey (2008) inscrevem Pipa na análise. O corpus contém estudos sobre infraestrutura, formação, políticas e atuação profissional, quase sempre examinados de maneira isolada, e permanece menos explorada a relação entre essas dimensões quando uma política nacional chega a uma rede municipal e é encenada em uma escola situada em condições territoriais e institucionais específicas. Nesse ponto está o problema empírico desta tese, que diz respeito ao modo como as orientações da PNED assumem sentidos e formas de atuação ao atravessar condições materiais, institucionais e territoriais específicas e encontrar profissionais da educação que, com suas culturas profissionais, tomam decisões situadas no cotidiano escolar.</w:t>
       </w:r>
     </w:p>
     <w:p>
@@ -17520,14 +17438,27 @@
     <w:p>
       <w:pPr>
         <w:spacing w:after="0" w:before="0" w:line="240" w:lineRule="auto"/>
-        <w:jc w:val="both"/>
+        <w:jc w:val="left"/>
         <w:rPr/>
       </w:pPr>
       <w:r>
         <w:rPr>
           <w:rtl w:val="0"/>
         </w:rPr>
-        <w:t xml:space="preserve">ALMEIDA, Maria Elizabeth Bianconcini de; VALENTE, José Armando. Tecnologias e currículo: trajetórias convergentes ou divergentes? São Paulo: Paulus, 2011.</w:t>
+        <w:t xml:space="preserve">ALMEIDA, Maria Elizabeth Bianconcini de; VALENTE, José Armando. </w:t>
+      </w:r>
+      <w:r>
+        <w:rPr>
+          <w:b/>
+          <w:rtl w:val="0"/>
+        </w:rPr>
+        <w:t xml:space="preserve">Tecnologias e currículo</w:t>
+      </w:r>
+      <w:r>
+        <w:rPr>
+          <w:rtl w:val="0"/>
+        </w:rPr>
+        <w:t xml:space="preserve">: trajetórias convergentes ou divergentes? São Paulo: Paulus, 2011.</w:t>
       </w:r>
     </w:p>
     <w:p>
@@ -17545,14 +17476,27 @@
     <w:p>
       <w:pPr>
         <w:spacing w:after="0" w:before="0" w:line="240" w:lineRule="auto"/>
-        <w:jc w:val="both"/>
+        <w:jc w:val="left"/>
         <w:rPr/>
       </w:pPr>
       <w:r>
         <w:rPr>
           <w:rtl w:val="0"/>
         </w:rPr>
-        <w:t>BALL, Stephen J. Performatividade, privatização e o pós-Estado do bem-estar. Educação &amp; Sociedade, Campinas, v. 25, n. 89, p. 1105-1126, set./dez. 2004.</w:t>
+        <w:t xml:space="preserve">BALL, Stephen J. Reformar escolas/reformar professores e os terrores da performatividade. </w:t>
+      </w:r>
+      <w:r>
+        <w:rPr>
+          <w:b/>
+          <w:rtl w:val="0"/>
+        </w:rPr>
+        <w:t xml:space="preserve">Revista Portuguesa de Educação</w:t>
+      </w:r>
+      <w:r>
+        <w:rPr>
+          <w:rtl w:val="0"/>
+        </w:rPr>
+        <w:t xml:space="preserve">, Braga, v. 15, n. 2, p. 3-23, 2002.</w:t>
       </w:r>
     </w:p>
     <w:p>
@@ -17570,14 +17514,27 @@
     <w:p>
       <w:pPr>
         <w:spacing w:after="0" w:before="0" w:line="240" w:lineRule="auto"/>
-        <w:jc w:val="both"/>
+        <w:jc w:val="left"/>
         <w:rPr/>
       </w:pPr>
       <w:r>
         <w:rPr>
           <w:rtl w:val="0"/>
         </w:rPr>
-        <w:t xml:space="preserve">BALL, Stephen J.; BOWE, Richard. Subject departments and the "implementation" of National Curriculum policy: an overview of the issues. Journal of Curriculum Studies, v. 24, n. 2, p. 97-115, 1992.</w:t>
+        <w:t xml:space="preserve">BALL, Stephen J. Performatividade, privatização e o pós-Estado do bem-estar. </w:t>
+      </w:r>
+      <w:r>
+        <w:rPr>
+          <w:b/>
+          <w:rtl w:val="0"/>
+        </w:rPr>
+        <w:t xml:space="preserve">Educação &amp; Sociedade</w:t>
+      </w:r>
+      <w:r>
+        <w:rPr>
+          <w:rtl w:val="0"/>
+        </w:rPr>
+        <w:t xml:space="preserve">, Campinas, v. 25, n. 89, p. 1105-1126, set./dez. 2004.</w:t>
       </w:r>
     </w:p>
     <w:p>
@@ -17595,14 +17552,27 @@
     <w:p>
       <w:pPr>
         <w:spacing w:after="0" w:before="0" w:line="240" w:lineRule="auto"/>
-        <w:jc w:val="both"/>
+        <w:jc w:val="left"/>
         <w:rPr/>
       </w:pPr>
       <w:r>
         <w:rPr>
           <w:rtl w:val="0"/>
         </w:rPr>
-        <w:t xml:space="preserve">BALL, Stephen J.; MAGUIRE, Meg; BRAUN, Annette. Como as escolas fazem as políticas: atuação em escolas secundárias. Tradução de Janete Bridon. Ponta Grossa: Editora UEPG, 2016.</w:t>
+        <w:t xml:space="preserve">BALL, Stephen J. </w:t>
+      </w:r>
+      <w:r>
+        <w:rPr>
+          <w:b/>
+          <w:rtl w:val="0"/>
+        </w:rPr>
+        <w:t xml:space="preserve">The education debate</w:t>
+      </w:r>
+      <w:r>
+        <w:rPr>
+          <w:rtl w:val="0"/>
+        </w:rPr>
+        <w:t xml:space="preserve">. Bristol: The Policy Press, 2008.</w:t>
       </w:r>
     </w:p>
     <w:p>
@@ -17620,14 +17590,27 @@
     <w:p>
       <w:pPr>
         <w:spacing w:after="0" w:before="0" w:line="240" w:lineRule="auto"/>
-        <w:jc w:val="both"/>
+        <w:jc w:val="left"/>
         <w:rPr/>
       </w:pPr>
       <w:r>
         <w:rPr>
           <w:rtl w:val="0"/>
         </w:rPr>
-        <w:t xml:space="preserve">BOWE, Richard; BALL, Stephen J.; GOLD, Anne. Reforming education and changing schools: case studies in policy sociology. London: Routledge, 1992.</w:t>
+        <w:t xml:space="preserve">BALL, Stephen J. Sociologia das políticas educacionais e pesquisa crítico-social: uma revisão pessoal das políticas educacionais e da pesquisa em política educacional. In: BALL, Stephen J.; MAINARDES, Jefferson (org.). </w:t>
+      </w:r>
+      <w:r>
+        <w:rPr>
+          <w:b/>
+          <w:rtl w:val="0"/>
+        </w:rPr>
+        <w:t xml:space="preserve">Políticas educacionais</w:t>
+      </w:r>
+      <w:r>
+        <w:rPr>
+          <w:rtl w:val="0"/>
+        </w:rPr>
+        <w:t xml:space="preserve">: questões e dilemas. São Paulo: Cortez, 2011. p. 21-53.</w:t>
       </w:r>
     </w:p>
     <w:p>
@@ -17645,14 +17628,27 @@
     <w:p>
       <w:pPr>
         <w:spacing w:after="0" w:before="0" w:line="240" w:lineRule="auto"/>
-        <w:jc w:val="both"/>
+        <w:jc w:val="left"/>
         <w:rPr/>
       </w:pPr>
       <w:r>
         <w:rPr>
           <w:rtl w:val="0"/>
         </w:rPr>
-        <w:t xml:space="preserve">BRASIL. Conselho Nacional de Educação. Câmara de Educação Básica. Resolução CNE/CEB nº 2, de 21 de março de 2025. Institui as Diretrizes Operacionais Nacionais sobre o uso de dispositivos digitais em espaços escolares e integração curricular de educação digital e midiática. Brasília, DF: Diário Oficial da União, 2025.</w:t>
+        <w:t xml:space="preserve">BALL, Stephen J.; BOWE, Richard. Subject departments and the "implementation" of National Curriculum policy: an overview of the issues. </w:t>
+      </w:r>
+      <w:r>
+        <w:rPr>
+          <w:b/>
+          <w:rtl w:val="0"/>
+        </w:rPr>
+        <w:t xml:space="preserve">Journal of Curriculum Studies</w:t>
+      </w:r>
+      <w:r>
+        <w:rPr>
+          <w:rtl w:val="0"/>
+        </w:rPr>
+        <w:t xml:space="preserve">, v. 24, n. 2, p. 97-115, 1992.</w:t>
       </w:r>
     </w:p>
     <w:p>
@@ -17670,14 +17666,27 @@
     <w:p>
       <w:pPr>
         <w:spacing w:after="0" w:before="0" w:line="240" w:lineRule="auto"/>
-        <w:jc w:val="both"/>
+        <w:jc w:val="left"/>
         <w:rPr/>
       </w:pPr>
       <w:r>
         <w:rPr>
           <w:rtl w:val="0"/>
         </w:rPr>
-        <w:t xml:space="preserve">BRASIL. Lei nº 9.394, de 20 de dezembro de 1996. Estabelece as diretrizes e bases da educação nacional. Brasília, DF: Diário Oficial da União, 1996.</w:t>
+        <w:t xml:space="preserve">BALL, Stephen J.; MAGUIRE, Meg; BRAUN, Annette. </w:t>
+      </w:r>
+      <w:r>
+        <w:rPr>
+          <w:b/>
+          <w:rtl w:val="0"/>
+        </w:rPr>
+        <w:t xml:space="preserve">Como as escolas fazem as políticas</w:t>
+      </w:r>
+      <w:r>
+        <w:rPr>
+          <w:rtl w:val="0"/>
+        </w:rPr>
+        <w:t xml:space="preserve">: atuação em escolas secundárias. Tradução de Janete Bridon. Ponta Grossa: Editora UEPG, 2016.</w:t>
       </w:r>
     </w:p>
     <w:p>
@@ -17695,14 +17704,27 @@
     <w:p>
       <w:pPr>
         <w:spacing w:after="0" w:before="0" w:line="240" w:lineRule="auto"/>
-        <w:jc w:val="both"/>
+        <w:jc w:val="left"/>
         <w:rPr/>
       </w:pPr>
       <w:r>
         <w:rPr>
           <w:rtl w:val="0"/>
         </w:rPr>
-        <w:t xml:space="preserve">BRASIL. Lei nº 14.533, de 11 de janeiro de 2023. Institui a Política Nacional de Educação Digital e altera as Leis nº 9.394, de 20 de dezembro de 1996, nº 9.448, de 14 de março de 1997, nº 10.260, de 12 de julho de 2001, e nº 10.753, de 30 de outubro de 2003. Diário Oficial da União: seção 1, Brasília, DF, 12 jan. 2023.</w:t>
+        <w:t xml:space="preserve">BOWE, Richard; BALL, Stephen J.; GOLD, Anne. </w:t>
+      </w:r>
+      <w:r>
+        <w:rPr>
+          <w:b/>
+          <w:rtl w:val="0"/>
+        </w:rPr>
+        <w:t xml:space="preserve">Reforming education and changing schools</w:t>
+      </w:r>
+      <w:r>
+        <w:rPr>
+          <w:rtl w:val="0"/>
+        </w:rPr>
+        <w:t xml:space="preserve">: case studies in policy sociology. London: Routledge, 1992.</w:t>
       </w:r>
     </w:p>
     <w:p>
@@ -17719,8 +17741,122 @@
     </w:p>
     <w:p>
       <w:pPr>
+        <w:spacing w:after="0" w:before="0" w:line="240" w:lineRule="auto"/>
+        <w:jc w:val="left"/>
+        <w:rPr/>
+      </w:pPr>
+      <w:r>
+        <w:rPr>
+          <w:rtl w:val="0"/>
+        </w:rPr>
+        <w:t xml:space="preserve">BRASIL. Conselho Nacional de Educação. Câmara de Educação Básica. Resolução CNE/CEB nº 2, de 21 de março de 2025. Institui as Diretrizes Operacionais Nacionais sobre o uso de dispositivos digitais em espaços escolares e integração curricular de educação digital e midiática. Brasília, DF: </w:t>
+      </w:r>
+      <w:r>
+        <w:rPr>
+          <w:b/>
+          <w:rtl w:val="0"/>
+        </w:rPr>
+        <w:t xml:space="preserve">Diário Oficial da União</w:t>
+      </w:r>
+      <w:r>
+        <w:rPr>
+          <w:rtl w:val="0"/>
+        </w:rPr>
+        <w:t xml:space="preserve">, 2025.</w:t>
+      </w:r>
+    </w:p>
+    <w:p>
+      <w:pPr>
+        <w:spacing w:after="0" w:before="0" w:line="240" w:lineRule="auto"/>
+        <w:jc w:val="both"/>
+        <w:rPr/>
+      </w:pPr>
+      <w:r>
+        <w:rPr>
+          <w:rtl w:val="0"/>
+        </w:rPr>
+      </w:r>
+    </w:p>
+    <w:p>
+      <w:pPr>
+        <w:spacing w:after="0" w:before="0" w:line="240" w:lineRule="auto"/>
+        <w:jc w:val="left"/>
+        <w:rPr/>
+      </w:pPr>
+      <w:r>
+        <w:rPr>
+          <w:rtl w:val="0"/>
+        </w:rPr>
+        <w:t xml:space="preserve">BRASIL. Lei nº 9.394, de 20 de dezembro de 1996. Estabelece as diretrizes e bases da educação nacional. Brasília, DF: </w:t>
+      </w:r>
+      <w:r>
+        <w:rPr>
+          <w:b/>
+          <w:rtl w:val="0"/>
+        </w:rPr>
+        <w:t xml:space="preserve">Diário Oficial da União</w:t>
+      </w:r>
+      <w:r>
+        <w:rPr>
+          <w:rtl w:val="0"/>
+        </w:rPr>
+        <w:t xml:space="preserve">, 1996.</w:t>
+      </w:r>
+    </w:p>
+    <w:p>
+      <w:pPr>
+        <w:spacing w:after="0" w:before="0" w:line="240" w:lineRule="auto"/>
+        <w:jc w:val="both"/>
+        <w:rPr/>
+      </w:pPr>
+      <w:r>
+        <w:rPr>
+          <w:rtl w:val="0"/>
+        </w:rPr>
+      </w:r>
+    </w:p>
+    <w:p>
+      <w:pPr>
+        <w:spacing w:after="0" w:before="0" w:line="240" w:lineRule="auto"/>
+        <w:jc w:val="left"/>
+        <w:rPr/>
+      </w:pPr>
+      <w:r>
+        <w:rPr>
+          <w:rtl w:val="0"/>
+        </w:rPr>
+        <w:t xml:space="preserve">BRASIL. Lei nº 14.533, de 11 de janeiro de 2023. Institui a Política Nacional de Educação Digital e altera as Leis nº 9.394, de 20 de dezembro de 1996, nº 9.448, de 14 de março de 1997, nº 10.260, de 12 de julho de 2001, e nº 10.753, de 30 de outubro de 2003. </w:t>
+      </w:r>
+      <w:r>
+        <w:rPr>
+          <w:b/>
+          <w:rtl w:val="0"/>
+        </w:rPr>
+        <w:t xml:space="preserve">Diário Oficial da União</w:t>
+      </w:r>
+      <w:r>
+        <w:rPr>
+          <w:rtl w:val="0"/>
+        </w:rPr>
+        <w:t xml:space="preserve">: seção 1, Brasília, DF, 12 jan. 2023.</w:t>
+      </w:r>
+    </w:p>
+    <w:p>
+      <w:pPr>
+        <w:spacing w:after="0" w:before="0" w:line="240" w:lineRule="auto"/>
+        <w:jc w:val="both"/>
+        <w:rPr/>
+      </w:pPr>
+      <w:r>
+        <w:rPr>
+          <w:rtl w:val="0"/>
+        </w:rPr>
+      </w:r>
+    </w:p>
+    <w:p>
+      <w:pPr>
         <w:spacing w:line="276" w:lineRule="auto"/>
-        <w:jc w:val="both"/>
+        <w:jc w:val="left"/>
         <w:rPr/>
       </w:pPr>
       <w:r>
@@ -17729,140 +17865,112 @@
           <w:iCs w:val="1"/>
           <w:rtl w:val="0"/>
         </w:rPr>
-        <w:t xml:space="preserve">BROWN, Jonathan</w:t>
-      </w:r>
-      <w:r>
-        <w:rPr>
+        <w:t xml:space="preserve">BROWN, Jonathan; McLENNAN, Carrie; MERCIECA, Daniela; MERCIECA, Duncan P.; ROBERTSON, Derek; VALENTINE, Eddie. Technology as Thirdspace: teachers in Scottish schools engaging with and being challenged by digital technology in first COVID-19 lockdown. </w:t>
+      </w:r>
+      <w:r>
+        <w:rPr>
+          <w:b/>
           <w:i w:val="1"/>
           <w:iCs w:val="1"/>
           <w:rtl w:val="0"/>
         </w:rPr>
-        <w:t xml:space="preserve">;</w:t>
-      </w:r>
-      <w:r>
-        <w:rPr>
-          <w:rtl w:val="0"/>
-        </w:rPr>
-        <w:t xml:space="preserve"> McLENNAN, Carrie; MERCIECA, Daniela; MERCIECA, Duncan P.; ROBERTSON, Derek; VALENTINE, Eddie. Technology as Thirdspace: teachers in Scottish schools engaging with and being challenged by digital technology in first COVID-19 lockdown. </w:t>
-      </w:r>
-      <w:r>
-        <w:rPr>
-          <w:b w:val="1"/>
-          <w:bCs w:val="1"/>
-          <w:rtl w:val="0"/>
-        </w:rPr>
         <w:t xml:space="preserve">Education Sciences</w:t>
       </w:r>
       <w:r>
-        <w:rPr>
-          <w:rtl w:val="0"/>
-        </w:rPr>
-        <w:t xml:space="preserve">, v. 11, n. 3, art. 136, 2021. DOI: https://doi.org/10.3390/educsci11030136.</w:t>
-      </w:r>
-    </w:p>
-    <w:p>
-      <w:pPr>
-        <w:spacing w:line="276" w:lineRule="auto"/>
-        <w:jc w:val="both"/>
-        <w:rPr/>
-      </w:pPr>
-      <w:r>
-        <w:rPr>
-          <w:rtl w:val="0"/>
-        </w:rPr>
-        <w:t xml:space="preserve"> </w:t>
-      </w:r>
-    </w:p>
-    <w:p>
-      <w:pPr>
-        <w:spacing w:line="276" w:lineRule="auto"/>
-        <w:jc w:val="both"/>
-        <w:rPr/>
-      </w:pPr>
-      <w:r>
-        <w:rPr>
-          <w:rtl w:val="0"/>
-        </w:rPr>
-        <w:t xml:space="preserve">BUCKINGHAM, David. </w:t>
-      </w:r>
-      <w:r>
-        <w:rPr>
-          <w:b w:val="1"/>
-          <w:bCs w:val="1"/>
-          <w:rtl w:val="0"/>
-        </w:rPr>
-        <w:t xml:space="preserve">Crescer na era das mídias</w:t>
-      </w:r>
-      <w:r>
-        <w:rPr>
-          <w:rtl w:val="0"/>
-        </w:rPr>
-        <w:t xml:space="preserve">: após a morte da infância. Tradução de Gilka Girardello e Isabel Orofino. Florianópolis: [s. n.], 2006. Título original: After the death of childhood: growing up in the age of electronic media.</w:t>
-      </w:r>
-    </w:p>
-    <w:p>
-      <w:pPr>
-        <w:spacing w:line="276" w:lineRule="auto"/>
-        <w:jc w:val="both"/>
-        <w:rPr/>
-      </w:pPr>
-      <w:r>
-        <w:rPr>
-          <w:rtl w:val="0"/>
-        </w:rPr>
-        <w:t xml:space="preserve"> </w:t>
-      </w:r>
-    </w:p>
-    <w:p>
-      <w:pPr>
-        <w:spacing w:line="276" w:lineRule="auto"/>
-        <w:jc w:val="both"/>
-        <w:rPr/>
-      </w:pPr>
-      <w:r>
-        <w:rPr>
-          <w:rtl w:val="0"/>
-        </w:rPr>
-        <w:t xml:space="preserve">CETIC.br. </w:t>
-      </w:r>
-      <w:r>
-        <w:rPr>
-          <w:b w:val="1"/>
-          <w:bCs w:val="1"/>
-          <w:rtl w:val="0"/>
-        </w:rPr>
-        <w:t xml:space="preserve">TIC Educação 2023</w:t>
-      </w:r>
-      <w:r>
-        <w:rPr>
-          <w:rtl w:val="0"/>
-        </w:rPr>
-        <w:t xml:space="preserve">: pesquisa sobre o uso das tecnologias de informação e comunicação nas escolas brasileiras. São Paulo: Comitê Gestor da Internet no Brasil (CGI.br), 2024.</w:t>
-      </w:r>
-    </w:p>
-    <w:p>
-      <w:pPr>
-        <w:spacing w:line="276" w:lineRule="auto"/>
-        <w:jc w:val="both"/>
         <w:rPr>
           <w:i w:val="1"/>
           <w:iCs w:val="1"/>
-        </w:rPr>
-      </w:pPr>
-      <w:r>
+          <w:rtl w:val="0"/>
+        </w:rPr>
+        <w:t xml:space="preserve">, v. 11, n. 3, art. 136, 2021. DOI: https://doi.org/10.3390/educsci11030136.</w:t>
+      </w:r>
+    </w:p>
+    <w:p>
+      <w:pPr>
+        <w:spacing w:line="276" w:lineRule="auto"/>
+        <w:jc w:val="left"/>
+        <w:rPr/>
+      </w:pPr>
+      <w:r>
+        <w:rPr>
+          <w:rtl w:val="0"/>
+        </w:rPr>
+        <w:t xml:space="preserve"> </w:t>
+      </w:r>
+    </w:p>
+    <w:p>
+      <w:pPr>
+        <w:spacing w:line="276" w:lineRule="auto"/>
+        <w:jc w:val="left"/>
+        <w:rPr/>
+      </w:pPr>
+      <w:r>
+        <w:rPr>
+          <w:rtl w:val="0"/>
+        </w:rPr>
+        <w:t xml:space="preserve">BUCKINGHAM, David. </w:t>
+      </w:r>
+      <w:r>
+        <w:rPr>
+          <w:b/>
+          <w:rtl w:val="0"/>
+        </w:rPr>
+        <w:t xml:space="preserve">Crescer na era das mídias</w:t>
+      </w:r>
+      <w:r>
+        <w:rPr>
+          <w:rtl w:val="0"/>
+        </w:rPr>
+        <w:t xml:space="preserve">: após a morte da infância. Tradução de Gilka Girardello e Isabel Orofino. Florianópolis: [s. n.], 2006. Título original: After the death of childhood: growing up in the age of electronic media.</w:t>
+      </w:r>
+    </w:p>
+    <w:p>
+      <w:pPr>
+        <w:spacing w:line="276" w:lineRule="auto"/>
+        <w:jc w:val="left"/>
+        <w:rPr/>
+      </w:pPr>
+      <w:r>
+        <w:rPr>
+          <w:rtl w:val="0"/>
+        </w:rPr>
+        <w:t xml:space="preserve"> </w:t>
+      </w:r>
+    </w:p>
+    <w:p>
+      <w:pPr>
+        <w:spacing w:line="276" w:lineRule="auto"/>
+        <w:jc w:val="left"/>
+        <w:rPr/>
+      </w:pPr>
+      <w:r>
+        <w:rPr>
+          <w:rtl w:val="0"/>
+        </w:rPr>
+        <w:t xml:space="preserve">CETIC.br. </w:t>
+      </w:r>
+      <w:r>
+        <w:rPr>
+          <w:b/>
+          <w:rtl w:val="0"/>
+        </w:rPr>
+        <w:t xml:space="preserve">TIC Educação 2023</w:t>
+      </w:r>
+      <w:r>
+        <w:rPr>
+          <w:rtl w:val="0"/>
+        </w:rPr>
+        <w:t xml:space="preserve">: pesquisa sobre o uso das tecnologias de informação e comunicação nas escolas brasileiras. São Paulo: Comitê Gestor da Internet no Brasil (CGI.br), 2024.</w:t>
+      </w:r>
+    </w:p>
+    <w:p>
+      <w:pPr>
+        <w:spacing w:line="276" w:lineRule="auto"/>
+        <w:jc w:val="left"/>
         <w:rPr>
           <w:i w:val="1"/>
           <w:iCs w:val="1"/>
-          <w:rtl w:val="0"/>
-        </w:rPr>
-        <w:t xml:space="preserve"> </w:t>
-      </w:r>
-    </w:p>
-    <w:p>
-      <w:pPr>
-        <w:spacing w:line="276" w:lineRule="auto"/>
-        <w:jc w:val="both"/>
-        <w:rPr/>
+        </w:rPr>
       </w:pPr>
       <w:r>
         <w:rPr>
@@ -17870,127 +17978,31 @@
           <w:iCs w:val="1"/>
           <w:rtl w:val="0"/>
         </w:rPr>
-        <w:t xml:space="preserve">GÓMEZ-NASHIKI, Antonio</w:t>
-      </w:r>
+        <w:t xml:space="preserve"> </w:t>
+      </w:r>
+    </w:p>
+    <w:p>
+      <w:pPr>
+        <w:spacing w:line="276" w:lineRule="auto"/>
+        <w:jc w:val="left"/>
+        <w:rPr/>
+      </w:pPr>
       <w:r>
         <w:rPr>
           <w:i w:val="1"/>
           <w:iCs w:val="1"/>
           <w:rtl w:val="0"/>
         </w:rPr>
-        <w:t xml:space="preserve">;</w:t>
-      </w:r>
-      <w:r>
-        <w:rPr>
-          <w:rtl w:val="0"/>
-        </w:rPr>
-        <w:t xml:space="preserve"> QUIJADA-LOVATÓN, Karin. Good practices of basic education teachers during the COVID-19 pandemic. </w:t>
-      </w:r>
-      <w:r>
-        <w:rPr>
-          <w:b w:val="1"/>
-          <w:bCs w:val="1"/>
-          <w:rtl w:val="0"/>
-        </w:rPr>
-        <w:t xml:space="preserve">Revista Innova Educación</w:t>
-      </w:r>
-      <w:r>
-        <w:rPr>
-          <w:rtl w:val="0"/>
-        </w:rPr>
-        <w:t xml:space="preserve">, v. 3, n. 4, p. 7-27, 2021. DOI: https://doi.org/10.35622/j.rie.2021.04.001.en.</w:t>
-      </w:r>
-    </w:p>
-    <w:p>
-      <w:pPr>
-        <w:spacing w:after="0" w:before="0" w:line="240" w:lineRule="auto"/>
-        <w:jc w:val="both"/>
-        <w:rPr/>
-      </w:pPr>
-      <w:r>
-        <w:rPr>
-          <w:rtl w:val="0"/>
-        </w:rPr>
-      </w:r>
-    </w:p>
-    <w:p>
-      <w:pPr>
-        <w:spacing w:line="276" w:lineRule="auto"/>
-        <w:jc w:val="both"/>
-        <w:rPr/>
-      </w:pPr>
-      <w:r>
-        <w:rPr>
-          <w:rtl w:val="0"/>
-        </w:rPr>
-        <w:t>HARGREAVES, Andy. Profesorado, cultura y postmodernidad: cambian los tiempos, cambia el profesorado. 5. ed. Madrid: Morata, 2005.</w:t>
-      </w:r>
-    </w:p>
-    <w:p>
-      <w:pPr>
-        <w:spacing w:after="0" w:before="0" w:line="240" w:lineRule="auto"/>
-        <w:jc w:val="both"/>
-        <w:rPr/>
-      </w:pPr>
-      <w:r>
-        <w:rPr>
-          <w:rtl w:val="0"/>
-        </w:rPr>
-      </w:r>
-    </w:p>
-    <w:p>
-      <w:pPr>
-        <w:spacing w:line="276" w:lineRule="auto"/>
-        <w:jc w:val="both"/>
-        <w:rPr/>
-      </w:pPr>
-      <w:r>
-        <w:rPr>
-          <w:rtl w:val="0"/>
-        </w:rPr>
-        <w:t xml:space="preserve">HONG, Quan Nha et al. The Mixed Methods Appraisal Tool (MMAT) version 2018 for information professionals and researchers. </w:t>
-      </w:r>
-      <w:r>
-        <w:rPr>
-          <w:b w:val="1"/>
-          <w:bCs w:val="1"/>
-          <w:rtl w:val="0"/>
-        </w:rPr>
-        <w:t xml:space="preserve">Education for Information</w:t>
-      </w:r>
-      <w:r>
-        <w:rPr>
-          <w:rtl w:val="0"/>
-        </w:rPr>
-        <w:t xml:space="preserve">, v. 34, n. 4, p. 285-291, 2018. DOI: https://doi.org/10.3233/EFI-180221.</w:t>
-      </w:r>
-    </w:p>
-    <w:p>
-      <w:pPr>
-        <w:spacing w:line="276" w:lineRule="auto"/>
-        <w:jc w:val="both"/>
-        <w:rPr/>
-      </w:pPr>
-      <w:r>
-        <w:rPr>
-          <w:rtl w:val="0"/>
-        </w:rPr>
-        <w:t xml:space="preserve"> </w:t>
-      </w:r>
-    </w:p>
-    <w:p>
-      <w:pPr>
-        <w:spacing w:line="276" w:lineRule="auto"/>
-        <w:jc w:val="both"/>
-        <w:rPr/>
-      </w:pPr>
-      <w:r>
-        <w:rPr>
+        <w:t xml:space="preserve">GÓMEZ-NASHIKI, Antonio; QUIJADA-LOVATÓN, Karin. Good practices of basic education teachers during the COVID-19 pandemic. </w:t>
+      </w:r>
+      <w:r>
+        <w:rPr>
+          <w:b/>
           <w:i w:val="1"/>
           <w:iCs w:val="1"/>
           <w:rtl w:val="0"/>
         </w:rPr>
-        <w:t>IVANISHCHENKO, Kateryna</w:t>
+        <w:t xml:space="preserve">Revista Innova Educación</w:t>
       </w:r>
       <w:r>
         <w:rPr>
@@ -17998,46 +18010,102 @@
           <w:iCs w:val="1"/>
           <w:rtl w:val="0"/>
         </w:rPr>
-        <w:t xml:space="preserve">;</w:t>
-      </w:r>
-      <w:r>
-        <w:rPr>
-          <w:rtl w:val="0"/>
-        </w:rPr>
-        <w:t xml:space="preserve"> BUSANA, Gilbert; REUTER, Robert A. P. Understanding factors affecting fundamental school teachers’ use of technology in Luxembourg through a survey study. </w:t>
-      </w:r>
-      <w:r>
-        <w:rPr>
-          <w:b w:val="1"/>
-          <w:bCs w:val="1"/>
-          <w:rtl w:val="0"/>
-        </w:rPr>
-        <w:t xml:space="preserve">Heliyon</w:t>
-      </w:r>
-      <w:r>
-        <w:rPr>
-          <w:rtl w:val="0"/>
-        </w:rPr>
-        <w:t xml:space="preserve">, v. 10, n. 7, e28704, 2024. DOI: https://doi.org/10.1016/j.heliyon.2024.e28704.</w:t>
+        <w:t xml:space="preserve">, v. 3, n. 4, p. 7-27, 2021. DOI: https://doi.org/10.35622/j.rie.2021.04.001.en.</w:t>
+      </w:r>
+    </w:p>
+    <w:p>
+      <w:pPr>
+        <w:spacing w:after="0" w:before="0" w:line="240" w:lineRule="auto"/>
+        <w:jc w:val="both"/>
+        <w:rPr/>
+      </w:pPr>
+      <w:r>
+        <w:rPr>
+          <w:rtl w:val="0"/>
+        </w:rPr>
       </w:r>
     </w:p>
     <w:p>
       <w:pPr>
         <w:spacing w:line="276" w:lineRule="auto"/>
-        <w:jc w:val="both"/>
+        <w:jc w:val="left"/>
         <w:rPr/>
       </w:pPr>
       <w:r>
         <w:rPr>
           <w:rtl w:val="0"/>
         </w:rPr>
+        <w:t xml:space="preserve">HARGREAVES, Andy. </w:t>
+      </w:r>
+      <w:r>
+        <w:rPr>
+          <w:b/>
+          <w:rtl w:val="0"/>
+        </w:rPr>
+        <w:t xml:space="preserve">Profesorado, cultura y postmodernidad</w:t>
+      </w:r>
+      <w:r>
+        <w:rPr>
+          <w:rtl w:val="0"/>
+        </w:rPr>
+        <w:t xml:space="preserve">: cambian los tiempos, cambia el profesorado. 5. ed. Madrid: Morata, 2005.</w:t>
+      </w:r>
+    </w:p>
+    <w:p>
+      <w:pPr>
+        <w:spacing w:after="0" w:before="0" w:line="240" w:lineRule="auto"/>
+        <w:jc w:val="both"/>
+        <w:rPr/>
+      </w:pPr>
+      <w:r>
+        <w:rPr>
+          <w:rtl w:val="0"/>
+        </w:rPr>
+      </w:r>
+    </w:p>
+    <w:p>
+      <w:pPr>
+        <w:spacing w:line="276" w:lineRule="auto"/>
+        <w:jc w:val="left"/>
+        <w:rPr/>
+      </w:pPr>
+      <w:r>
+        <w:rPr>
+          <w:rtl w:val="0"/>
+        </w:rPr>
+        <w:t xml:space="preserve">HONG, Quan Nha et al. The Mixed Methods Appraisal Tool (MMAT) version 2018 for information professionals and researchers. </w:t>
+      </w:r>
+      <w:r>
+        <w:rPr>
+          <w:b/>
+          <w:rtl w:val="0"/>
+        </w:rPr>
+        <w:t xml:space="preserve">Education for Information</w:t>
+      </w:r>
+      <w:r>
+        <w:rPr>
+          <w:rtl w:val="0"/>
+        </w:rPr>
+        <w:t xml:space="preserve">, v. 34, n. 4, p. 285-291, 2018. DOI: https://doi.org/10.3233/EFI-180221.</w:t>
+      </w:r>
+    </w:p>
+    <w:p>
+      <w:pPr>
+        <w:spacing w:line="276" w:lineRule="auto"/>
+        <w:jc w:val="left"/>
+        <w:rPr/>
+      </w:pPr>
+      <w:r>
+        <w:rPr>
+          <w:rtl w:val="0"/>
+        </w:rPr>
         <w:t xml:space="preserve"> </w:t>
       </w:r>
     </w:p>
     <w:p>
       <w:pPr>
         <w:spacing w:line="276" w:lineRule="auto"/>
-        <w:jc w:val="both"/>
+        <w:jc w:val="left"/>
         <w:rPr/>
       </w:pPr>
       <w:r>
@@ -18046,359 +18114,61 @@
           <w:iCs w:val="1"/>
           <w:rtl w:val="0"/>
         </w:rPr>
-        <w:t xml:space="preserve">KARAFERYE, Figen</w:t>
-      </w:r>
-      <w:r>
-        <w:rPr>
+        <w:t xml:space="preserve">IVANISHCHENKO, Kateryna; BUSANA, Gilbert; REUTER, Robert A. P. Understanding factors affecting fundamental school teachers’ use of technology in Luxembourg through a survey study. </w:t>
+      </w:r>
+      <w:r>
+        <w:rPr>
+          <w:b/>
           <w:i w:val="1"/>
           <w:iCs w:val="1"/>
           <w:rtl w:val="0"/>
         </w:rPr>
-        <w:t xml:space="preserve">.</w:t>
-      </w:r>
-      <w:r>
-        <w:rPr>
-          <w:rtl w:val="0"/>
-        </w:rPr>
-        <w:t xml:space="preserve"> Digital teaching and learning: exploring primary school teachers’ approaches, sources of concern &amp; expectations. </w:t>
-      </w:r>
-      <w:r>
-        <w:rPr>
-          <w:b w:val="1"/>
-          <w:bCs w:val="1"/>
-          <w:rtl w:val="0"/>
-        </w:rPr>
-        <w:t xml:space="preserve">Journal of Educational Technology and Online Learning</w:t>
-      </w:r>
-      <w:r>
-        <w:rPr>
-          <w:rtl w:val="0"/>
-        </w:rPr>
-        <w:t xml:space="preserve">, v. 5, n. 4, p. 808-824, 2022. DOI: https://doi.org/10.31681/jetol.1156717.</w:t>
-      </w:r>
-    </w:p>
-    <w:p>
-      <w:pPr>
-        <w:spacing w:line="276" w:lineRule="auto"/>
-        <w:jc w:val="both"/>
-        <w:rPr/>
-      </w:pPr>
-      <w:r>
-        <w:rPr>
-          <w:rtl w:val="0"/>
-        </w:rPr>
-        <w:t xml:space="preserve"> </w:t>
-      </w:r>
-    </w:p>
-    <w:p>
-      <w:pPr>
-        <w:spacing w:line="276" w:lineRule="auto"/>
-        <w:jc w:val="both"/>
-        <w:rPr/>
-      </w:pPr>
-      <w:r>
-        <w:rPr>
-          <w:rtl w:val="0"/>
-        </w:rPr>
-        <w:t xml:space="preserve">KITCHENHAM, Barbara; CHARTERS, Stuart. </w:t>
-      </w:r>
-      <w:r>
-        <w:rPr>
-          <w:b w:val="1"/>
-          <w:bCs w:val="1"/>
-          <w:rtl w:val="0"/>
-        </w:rPr>
-        <w:t xml:space="preserve">Guidelines for performing systematic literature reviews in software engineering</w:t>
-      </w:r>
-      <w:r>
-        <w:rPr>
-          <w:rtl w:val="0"/>
-        </w:rPr>
-        <w:t xml:space="preserve">. Version 2.3. Keele: Keele University; Durham: University of Durham, 2007.</w:t>
-      </w:r>
-    </w:p>
-    <w:p>
-      <w:pPr>
-        <w:spacing w:line="276" w:lineRule="auto"/>
-        <w:jc w:val="both"/>
-        <w:rPr/>
-      </w:pPr>
-      <w:r>
-        <w:rPr>
-          <w:rtl w:val="0"/>
-        </w:rPr>
-        <w:t xml:space="preserve"> </w:t>
-      </w:r>
-    </w:p>
-    <w:p>
-      <w:pPr>
-        <w:spacing w:line="276" w:lineRule="auto"/>
-        <w:jc w:val="both"/>
-        <w:rPr/>
-      </w:pPr>
-      <w:r>
-        <w:rPr>
-          <w:rtl w:val="0"/>
-        </w:rPr>
-        <w:t xml:space="preserve">LOCKWOOD, Craig et al. Qualitative research synthesis: methodological guidance for systematic reviewers utilizing meta-aggregation. </w:t>
-      </w:r>
-      <w:r>
-        <w:rPr>
-          <w:b w:val="1"/>
-          <w:bCs w:val="1"/>
-          <w:rtl w:val="0"/>
-        </w:rPr>
-        <w:t xml:space="preserve">International Journal of Evidence-Based Healthcare</w:t>
-      </w:r>
-      <w:r>
-        <w:rPr>
-          <w:rtl w:val="0"/>
-        </w:rPr>
-        <w:t xml:space="preserve">, v. 13, n. 3, p. 179-187, 2015. DOI: https://doi.org/10.1097/XEB.0000000000000062.</w:t>
-      </w:r>
-    </w:p>
-    <w:p>
-      <w:pPr>
-        <w:spacing w:line="276" w:lineRule="auto"/>
-        <w:jc w:val="both"/>
-        <w:rPr/>
-      </w:pPr>
-      <w:r>
-        <w:rPr>
-          <w:rtl w:val="0"/>
-        </w:rPr>
-        <w:t xml:space="preserve"> </w:t>
-      </w:r>
-    </w:p>
-    <w:p>
-      <w:pPr>
-        <w:spacing w:line="276" w:lineRule="auto"/>
-        <w:jc w:val="both"/>
-        <w:rPr/>
-      </w:pPr>
+        <w:t xml:space="preserve">Heliyon</w:t>
+      </w:r>
       <w:r>
         <w:rPr>
           <w:i w:val="1"/>
           <w:iCs w:val="1"/>
           <w:rtl w:val="0"/>
         </w:rPr>
-        <w:t>NUNES, Maria das Graças da Silva</w:t>
-      </w:r>
+        <w:t xml:space="preserve">, v. 10, n. 7, e28704, 2024. DOI: https://doi.org/10.1016/j.heliyon.2024.e28704.</w:t>
+      </w:r>
+    </w:p>
+    <w:p>
+      <w:pPr>
+        <w:spacing w:line="276" w:lineRule="auto"/>
+        <w:jc w:val="left"/>
+        <w:rPr/>
+      </w:pPr>
+      <w:r>
+        <w:rPr>
+          <w:rtl w:val="0"/>
+        </w:rPr>
+        <w:t xml:space="preserve"> </w:t>
+      </w:r>
+    </w:p>
+    <w:p>
+      <w:pPr>
+        <w:spacing w:line="276" w:lineRule="auto"/>
+        <w:jc w:val="left"/>
+        <w:rPr/>
+      </w:pPr>
       <w:r>
         <w:rPr>
           <w:i w:val="1"/>
           <w:iCs w:val="1"/>
           <w:rtl w:val="0"/>
         </w:rPr>
-        <w:t xml:space="preserve">.</w:t>
-      </w:r>
-      <w:r>
-        <w:rPr>
-          <w:rtl w:val="0"/>
-        </w:rPr>
-        <w:t xml:space="preserve"> </w:t>
-      </w:r>
-      <w:r>
-        <w:rPr>
-          <w:b w:val="1"/>
-          <w:bCs w:val="1"/>
-          <w:rtl w:val="0"/>
-        </w:rPr>
-        <w:t xml:space="preserve">Tecnologias digitais no ciclo de alfabetização</w:t>
-      </w:r>
-      <w:r>
-        <w:rPr>
-          <w:rtl w:val="0"/>
-        </w:rPr>
-        <w:t xml:space="preserve">: uma avaliação sobre a formação de professores na rede municipal de Fortaleza. 2024. Dissertação (Mestrado Profissional em Avaliação de Políticas Públicas) – Universidade Federal do Ceará, Fortaleza, 2024. Disponível em: http://repositorio.ufc.br/handle/riufc/77156. Acesso em: 15 set. 2026.</w:t>
-      </w:r>
-    </w:p>
-    <w:p>
-      <w:pPr>
-        <w:spacing w:line="276" w:lineRule="auto"/>
-        <w:jc w:val="both"/>
-        <w:rPr/>
-      </w:pPr>
-      <w:r>
-        <w:rPr>
-          <w:rtl w:val="0"/>
-        </w:rPr>
-        <w:t xml:space="preserve"> </w:t>
-      </w:r>
-    </w:p>
-    <w:p>
-      <w:pPr>
-        <w:spacing w:line="276" w:lineRule="auto"/>
-        <w:jc w:val="both"/>
-        <w:rPr/>
-      </w:pPr>
-      <w:r>
-        <w:rPr>
-          <w:rtl w:val="0"/>
-        </w:rPr>
-        <w:t xml:space="preserve">OCDE. </w:t>
-      </w:r>
-      <w:r>
-        <w:rPr>
-          <w:b w:val="1"/>
-          <w:bCs w:val="1"/>
-          <w:rtl w:val="0"/>
-        </w:rPr>
-        <w:t xml:space="preserve">Digital Education Outlook 2023</w:t>
-      </w:r>
-      <w:r>
-        <w:rPr>
-          <w:rtl w:val="0"/>
-        </w:rPr>
-        <w:t xml:space="preserve">: towards an effective digital education ecosystem. Paris: OECD Publishing, 2023. DOI: https://doi.org/10.1787/c74f03de-en.</w:t>
-      </w:r>
-    </w:p>
-    <w:p>
-      <w:pPr>
-        <w:spacing w:line="276" w:lineRule="auto"/>
-        <w:jc w:val="both"/>
-        <w:rPr/>
-      </w:pPr>
-      <w:r>
-        <w:rPr>
-          <w:rtl w:val="0"/>
-        </w:rPr>
-        <w:t xml:space="preserve"> </w:t>
-      </w:r>
-    </w:p>
-    <w:p>
-      <w:pPr>
-        <w:spacing w:line="276" w:lineRule="auto"/>
-        <w:jc w:val="both"/>
-        <w:rPr/>
-      </w:pPr>
-      <w:r>
-        <w:rPr>
-          <w:rtl w:val="0"/>
-        </w:rPr>
-        <w:t xml:space="preserve">OKOLI, Chitu. Guia para realizar uma revisão sistemática da literatura. Tradução de David Wesley Amado Duarte; revisão técnica de João Mattar. </w:t>
-      </w:r>
-      <w:r>
-        <w:rPr>
-          <w:b w:val="1"/>
-          <w:bCs w:val="1"/>
-          <w:rtl w:val="0"/>
-        </w:rPr>
-        <w:t xml:space="preserve">EaD em Foco</w:t>
-      </w:r>
-      <w:r>
-        <w:rPr>
-          <w:rtl w:val="0"/>
-        </w:rPr>
-        <w:t xml:space="preserve">, v. 9, n. 1, e748, 2019. DOI: https://doi.org/10.18264/eadf.v9i1.748.</w:t>
-      </w:r>
-    </w:p>
-    <w:p>
-      <w:pPr>
-        <w:spacing w:line="276" w:lineRule="auto"/>
-        <w:jc w:val="both"/>
-        <w:rPr/>
-      </w:pPr>
-      <w:r>
-        <w:rPr>
-          <w:rtl w:val="0"/>
-        </w:rPr>
-        <w:t xml:space="preserve"> </w:t>
-      </w:r>
-    </w:p>
-    <w:p>
-      <w:pPr>
-        <w:spacing w:line="276" w:lineRule="auto"/>
-        <w:jc w:val="both"/>
-        <w:rPr/>
-      </w:pPr>
-      <w:r>
-        <w:rPr>
-          <w:rtl w:val="0"/>
-        </w:rPr>
-        <w:t xml:space="preserve">OKOLI, Chitu; SCHABRAM, Kira. A guide to conducting a systematic literature review of information systems research. </w:t>
-      </w:r>
-      <w:r>
-        <w:rPr>
-          <w:b w:val="1"/>
-          <w:bCs w:val="1"/>
-          <w:rtl w:val="0"/>
-        </w:rPr>
-        <w:t xml:space="preserve">Working Papers on Information Systems</w:t>
-      </w:r>
-      <w:r>
-        <w:rPr>
-          <w:rtl w:val="0"/>
-        </w:rPr>
-        <w:t xml:space="preserve">, v. 10, n. 26, 2010.</w:t>
-      </w:r>
-    </w:p>
-    <w:p>
-      <w:pPr>
-        <w:spacing w:line="276" w:lineRule="auto"/>
-        <w:jc w:val="both"/>
-        <w:rPr/>
-      </w:pPr>
-      <w:r>
-        <w:rPr>
-          <w:rtl w:val="0"/>
-        </w:rPr>
-        <w:t xml:space="preserve"> </w:t>
-      </w:r>
-    </w:p>
-    <w:p>
-      <w:pPr>
-        <w:spacing w:line="276" w:lineRule="auto"/>
-        <w:jc w:val="both"/>
-        <w:rPr/>
-      </w:pPr>
-      <w:r>
-        <w:rPr>
-          <w:rtl w:val="0"/>
-        </w:rPr>
-        <w:t xml:space="preserve">PAGE, Matthew J. et al. A declaração PRISMA 2020: diretriz atualizada para relatar revisões sistemáticas. </w:t>
-      </w:r>
-      <w:r>
-        <w:rPr>
-          <w:b w:val="1"/>
-          <w:bCs w:val="1"/>
-          <w:rtl w:val="0"/>
-        </w:rPr>
-        <w:t xml:space="preserve">Epidemiologia e Serviços de Saúde</w:t>
-      </w:r>
-      <w:r>
-        <w:rPr>
-          <w:rtl w:val="0"/>
-        </w:rPr>
-        <w:t xml:space="preserve">, Brasília, v. 31, n. 2, e2022107, 2022. DOI: https://doi.org/10.1590/S1679-49742022000200033.</w:t>
-      </w:r>
-    </w:p>
-    <w:p>
-      <w:pPr>
-        <w:spacing w:line="276" w:lineRule="auto"/>
-        <w:jc w:val="both"/>
-        <w:rPr/>
-      </w:pPr>
-      <w:r>
-        <w:rPr>
-          <w:rtl w:val="0"/>
-        </w:rPr>
-        <w:t xml:space="preserve"> </w:t>
-      </w:r>
-    </w:p>
-    <w:p>
-      <w:pPr>
-        <w:spacing w:line="276" w:lineRule="auto"/>
-        <w:jc w:val="both"/>
-        <w:rPr/>
-      </w:pPr>
-      <w:r>
-        <w:rPr>
+        <w:t xml:space="preserve">KARAFERYE, Figen. Digital teaching and learning: exploring primary school teachers’ approaches, sources of concern &amp; expectations. </w:t>
+      </w:r>
+      <w:r>
+        <w:rPr>
+          <w:b/>
           <w:i w:val="1"/>
           <w:iCs w:val="1"/>
           <w:rtl w:val="0"/>
         </w:rPr>
-        <w:t>PAÑOS-CASTRO, Jessica</w:t>
+        <w:t xml:space="preserve">Journal of Educational Technology and Online Learning</w:t>
       </w:r>
       <w:r>
         <w:rPr>
@@ -18406,33 +18176,13 @@
           <w:iCs w:val="1"/>
           <w:rtl w:val="0"/>
         </w:rPr>
-        <w:t xml:space="preserve">;</w:t>
-      </w:r>
-      <w:r>
-        <w:rPr>
-          <w:rtl w:val="0"/>
-        </w:rPr>
-        <w:t xml:space="preserve"> ARRUTI, Arantza; KORRES, Oihane. COVID and ICT in primary education: challenges faced by teachers in the Basque Country. </w:t>
-      </w:r>
-      <w:r>
-        <w:rPr>
-          <w:b w:val="1"/>
-          <w:bCs w:val="1"/>
-          <w:rtl w:val="0"/>
-        </w:rPr>
-        <w:t xml:space="preserve">Sustainability</w:t>
-      </w:r>
-      <w:r>
-        <w:rPr>
-          <w:rtl w:val="0"/>
-        </w:rPr>
-        <w:t xml:space="preserve">, v. 14, n. 16, art. 10452, 2022. DOI: https://doi.org/10.3390/su141610452.</w:t>
+        <w:t xml:space="preserve">, v. 5, n. 4, p. 808-824, 2022. DOI: https://doi.org/10.31681/jetol.1156717.</w:t>
       </w:r>
     </w:p>
     <w:p>
       <w:pPr>
         <w:spacing w:line="276" w:lineRule="auto"/>
-        <w:jc w:val="both"/>
+        <w:jc w:val="left"/>
         <w:rPr/>
       </w:pPr>
       <w:r>
@@ -18445,7 +18195,163 @@
     <w:p>
       <w:pPr>
         <w:spacing w:line="276" w:lineRule="auto"/>
-        <w:jc w:val="both"/>
+        <w:jc w:val="left"/>
+        <w:rPr/>
+      </w:pPr>
+      <w:r>
+        <w:rPr>
+          <w:rtl w:val="0"/>
+        </w:rPr>
+        <w:t xml:space="preserve">KITCHENHAM, Barbara; CHARTERS, Stuart. </w:t>
+      </w:r>
+      <w:r>
+        <w:rPr>
+          <w:b/>
+          <w:rtl w:val="0"/>
+        </w:rPr>
+        <w:t xml:space="preserve">Guidelines for performing systematic literature reviews in software engineering</w:t>
+      </w:r>
+      <w:r>
+        <w:rPr>
+          <w:rtl w:val="0"/>
+        </w:rPr>
+        <w:t xml:space="preserve">. Version 2.3. Keele: Keele University; Durham: University of Durham, 2007.</w:t>
+      </w:r>
+    </w:p>
+    <w:p>
+      <w:pPr>
+        <w:spacing w:line="276" w:lineRule="auto"/>
+        <w:jc w:val="left"/>
+        <w:rPr/>
+      </w:pPr>
+      <w:r>
+        <w:rPr>
+          <w:rtl w:val="0"/>
+        </w:rPr>
+        <w:t xml:space="preserve"> </w:t>
+      </w:r>
+    </w:p>
+    <w:p>
+      <w:pPr>
+        <w:spacing w:line="276" w:lineRule="auto"/>
+        <w:jc w:val="left"/>
+        <w:rPr/>
+      </w:pPr>
+      <w:r>
+        <w:rPr>
+          <w:rtl w:val="0"/>
+        </w:rPr>
+        <w:t xml:space="preserve">LOCKWOOD, Craig et al. Qualitative research synthesis: methodological guidance for systematic reviewers utilizing meta-aggregation. </w:t>
+      </w:r>
+      <w:r>
+        <w:rPr>
+          <w:b/>
+          <w:rtl w:val="0"/>
+        </w:rPr>
+        <w:t xml:space="preserve">International Journal of Evidence-Based Healthcare</w:t>
+      </w:r>
+      <w:r>
+        <w:rPr>
+          <w:rtl w:val="0"/>
+        </w:rPr>
+        <w:t xml:space="preserve">, v. 13, n. 3, p. 179-187, 2015. DOI: https://doi.org/10.1097/XEB.0000000000000062.</w:t>
+      </w:r>
+    </w:p>
+    <w:p>
+      <w:pPr>
+        <w:spacing w:line="276" w:lineRule="auto"/>
+        <w:jc w:val="left"/>
+        <w:rPr/>
+      </w:pPr>
+      <w:r>
+        <w:rPr>
+          <w:rtl w:val="0"/>
+        </w:rPr>
+        <w:t xml:space="preserve"> </w:t>
+      </w:r>
+    </w:p>
+    <w:p>
+      <w:pPr>
+        <w:spacing w:line="276" w:lineRule="auto"/>
+        <w:jc w:val="left"/>
+        <w:rPr/>
+      </w:pPr>
+      <w:r>
+        <w:rPr>
+          <w:rtl w:val="0"/>
+        </w:rPr>
+        <w:t xml:space="preserve">MAINARDES, Jefferson. Abordagem do ciclo de políticas: uma contribuição para a análise de políticas educacionais. </w:t>
+      </w:r>
+      <w:r>
+        <w:rPr>
+          <w:b/>
+          <w:rtl w:val="0"/>
+        </w:rPr>
+        <w:t xml:space="preserve">Educação &amp; Sociedade</w:t>
+      </w:r>
+      <w:r>
+        <w:rPr>
+          <w:rtl w:val="0"/>
+        </w:rPr>
+        <w:t xml:space="preserve">, Campinas, v. 27, n. 94, p. 47-69, jan./abr. 2006.</w:t>
+      </w:r>
+    </w:p>
+    <w:p>
+      <w:pPr>
+        <w:spacing w:line="276" w:lineRule="auto"/>
+        <w:jc w:val="left"/>
+        <w:rPr/>
+      </w:pPr>
+      <w:r>
+        <w:rPr>
+          <w:rtl w:val="0"/>
+        </w:rPr>
+        <w:t xml:space="preserve"> </w:t>
+      </w:r>
+    </w:p>
+    <w:p>
+      <w:pPr>
+        <w:spacing w:line="276" w:lineRule="auto"/>
+        <w:jc w:val="left"/>
+        <w:rPr/>
+      </w:pPr>
+      <w:r>
+        <w:rPr>
+          <w:rtl w:val="0"/>
+        </w:rPr>
+        <w:t xml:space="preserve">MASSEY, Doreen. </w:t>
+      </w:r>
+      <w:r>
+        <w:rPr>
+          <w:b/>
+          <w:rtl w:val="0"/>
+        </w:rPr>
+        <w:t xml:space="preserve">Pelo espaço</w:t>
+      </w:r>
+      <w:r>
+        <w:rPr>
+          <w:rtl w:val="0"/>
+        </w:rPr>
+        <w:t xml:space="preserve">: uma nova política da espacialidade. Tradução de Hilda Pareto Maciel e Rogério Haesbaert. Rio de Janeiro: Bertrand Brasil, 2008.</w:t>
+      </w:r>
+    </w:p>
+    <w:p>
+      <w:pPr>
+        <w:spacing w:line="276" w:lineRule="auto"/>
+        <w:jc w:val="left"/>
+        <w:rPr/>
+      </w:pPr>
+      <w:r>
+        <w:rPr>
+          <w:rtl w:val="0"/>
+        </w:rPr>
+        <w:t xml:space="preserve"> </w:t>
+      </w:r>
+    </w:p>
+    <w:p>
+      <w:pPr>
+        <w:spacing w:line="276" w:lineRule="auto"/>
+        <w:jc w:val="left"/>
         <w:rPr/>
       </w:pPr>
       <w:r>
@@ -18454,429 +18360,217 @@
           <w:iCs w:val="1"/>
           <w:rtl w:val="0"/>
         </w:rPr>
-        <w:t xml:space="preserve">PEREIRA, Max Augusto Franco</w:t>
-      </w:r>
-      <w:r>
-        <w:rPr>
+        <w:t xml:space="preserve">NUNES, Maria das Graças da Silva. </w:t>
+      </w:r>
+      <w:r>
+        <w:rPr>
+          <w:b/>
           <w:i w:val="1"/>
           <w:iCs w:val="1"/>
           <w:rtl w:val="0"/>
         </w:rPr>
-        <w:t xml:space="preserve">.</w:t>
-      </w:r>
-      <w:r>
-        <w:rPr>
-          <w:rtl w:val="0"/>
-        </w:rPr>
-        <w:t xml:space="preserve"> </w:t>
-      </w:r>
-      <w:r>
-        <w:rPr>
-          <w:b w:val="1"/>
-          <w:bCs w:val="1"/>
-          <w:rtl w:val="0"/>
-        </w:rPr>
-        <w:t xml:space="preserve">As políticas educacionais para inserção de tecnologias digitais no ensino fundamental em Aracaju</w:t>
-      </w:r>
-      <w:r>
-        <w:rPr>
-          <w:rtl w:val="0"/>
-        </w:rPr>
-        <w:t xml:space="preserve">: uma análise do processo discursivo dos contextos de influências. 2022. Tese (Doutorado em Educação) – Universidade Federal de Sergipe, São Cristóvão, 2022. Disponível em: http://ri.ufs.br/jspui/handle/riufs/16761. Acesso em: 15 set. 2026.</w:t>
-      </w:r>
-    </w:p>
-    <w:p>
-      <w:pPr>
-        <w:spacing w:line="276" w:lineRule="auto"/>
-        <w:jc w:val="both"/>
-        <w:rPr/>
-      </w:pPr>
-      <w:r>
-        <w:rPr>
-          <w:rtl w:val="0"/>
-        </w:rPr>
-        <w:t xml:space="preserve"> </w:t>
-      </w:r>
-    </w:p>
-    <w:p>
-      <w:pPr>
-        <w:spacing w:line="276" w:lineRule="auto"/>
-        <w:jc w:val="both"/>
-        <w:rPr/>
-      </w:pPr>
-      <w:r>
-        <w:rPr>
-          <w:rtl w:val="0"/>
-        </w:rPr>
-        <w:t xml:space="preserve">PRENSKY, Marc. Digital natives, digital immigrants. </w:t>
-      </w:r>
-      <w:r>
-        <w:rPr>
-          <w:b w:val="1"/>
-          <w:bCs w:val="1"/>
-          <w:rtl w:val="0"/>
-        </w:rPr>
-        <w:t xml:space="preserve">On the Horizon</w:t>
-      </w:r>
-      <w:r>
-        <w:rPr>
-          <w:rtl w:val="0"/>
-        </w:rPr>
-        <w:t xml:space="preserve">, v. 9, n. 5, p. 1-6, 2001. DOI: https://doi.org/10.1108/10748120110424816.</w:t>
-      </w:r>
-    </w:p>
-    <w:p>
-      <w:pPr>
-        <w:spacing w:line="276" w:lineRule="auto"/>
-        <w:jc w:val="both"/>
-        <w:rPr/>
-      </w:pPr>
-      <w:r>
-        <w:rPr>
-          <w:rtl w:val="0"/>
-        </w:rPr>
-        <w:t xml:space="preserve"> </w:t>
-      </w:r>
-    </w:p>
-    <w:p>
-      <w:pPr>
-        <w:spacing w:line="276" w:lineRule="auto"/>
-        <w:jc w:val="both"/>
-        <w:rPr/>
-      </w:pPr>
-      <w:r>
-        <w:rPr>
-          <w:rtl w:val="0"/>
-        </w:rPr>
-        <w:t xml:space="preserve">QUEZADA-MORALES, Romina. The Provision of Learning in Mexico during the COVID-19 Pandemic: Defining the Digital Divide. </w:t>
-      </w:r>
-      <w:r>
-        <w:rPr>
-          <w:b w:val="1"/>
-          <w:bCs w:val="1"/>
-          <w:rtl w:val="0"/>
-        </w:rPr>
-        <w:t xml:space="preserve">Current Issues in Comparative Education</w:t>
-      </w:r>
-      <w:r>
-        <w:rPr>
-          <w:rtl w:val="0"/>
-        </w:rPr>
-        <w:t xml:space="preserve">, Nova York, v. 24, n. 2, p. 204-216, 2022. DOI: </w:t>
-      </w:r>
-      <w:r>
-        <w:rPr>
-          <w:rtl w:val="0"/>
-        </w:rPr>
-        <w:t xml:space="preserve">https://doi.org/10.52214/cice.v24i2.9497.</w:t>
-      </w:r>
-    </w:p>
-    <w:p>
-      <w:pPr>
-        <w:spacing w:line="276" w:lineRule="auto"/>
-        <w:jc w:val="both"/>
-        <w:rPr/>
-      </w:pPr>
-      <w:r>
-        <w:rPr>
-          <w:rtl w:val="0"/>
-        </w:rPr>
-        <w:t xml:space="preserve"> </w:t>
-      </w:r>
-    </w:p>
-    <w:p>
-      <w:pPr>
-        <w:spacing w:line="276" w:lineRule="auto"/>
-        <w:jc w:val="both"/>
-        <w:rPr/>
-      </w:pPr>
-      <w:r>
-        <w:rPr>
-          <w:rtl w:val="0"/>
-        </w:rPr>
-        <w:t xml:space="preserve">ROJO, Roxane.</w:t>
-      </w:r>
-      <w:r>
-        <w:rPr>
-          <w:rtl w:val="0"/>
-        </w:rPr>
-        <w:t xml:space="preserve"> </w:t>
-      </w:r>
-      <w:r>
-        <w:rPr>
-          <w:rtl w:val="0"/>
-        </w:rPr>
-        <w:t xml:space="preserve">Gêneros discursivos do Círculo de Bakhtin e multiletramentos.</w:t>
-      </w:r>
-      <w:r>
-        <w:rPr>
-          <w:rtl w:val="0"/>
-        </w:rPr>
-        <w:t xml:space="preserve"> In: ROJO, Roxane (org.). </w:t>
-      </w:r>
-      <w:r>
-        <w:rPr>
-          <w:b w:val="1"/>
-          <w:bCs w:val="1"/>
-          <w:rtl w:val="0"/>
-        </w:rPr>
-        <w:t xml:space="preserve">Escol@ conectada</w:t>
-      </w:r>
-      <w:r>
-        <w:rPr>
-          <w:rtl w:val="0"/>
-        </w:rPr>
-        <w:t xml:space="preserve">: os multiletramentos e as TICs. São Paulo: </w:t>
-      </w:r>
-      <w:r>
-        <w:rPr>
-          <w:rtl w:val="0"/>
-        </w:rPr>
-        <w:t xml:space="preserve">Parábola, 2013. p. 13-36.</w:t>
-      </w:r>
-    </w:p>
-    <w:p>
-      <w:pPr>
-        <w:spacing w:line="276" w:lineRule="auto"/>
-        <w:jc w:val="both"/>
-        <w:rPr/>
-      </w:pPr>
-      <w:r>
-        <w:rPr>
-          <w:rtl w:val="0"/>
-        </w:rPr>
-        <w:t xml:space="preserve"> </w:t>
-      </w:r>
-    </w:p>
-    <w:p>
-      <w:pPr>
-        <w:spacing w:line="276" w:lineRule="auto"/>
-        <w:jc w:val="both"/>
-        <w:rPr/>
-      </w:pPr>
-      <w:r>
-        <w:rPr>
-          <w:rtl w:val="0"/>
-        </w:rPr>
-        <w:t xml:space="preserve">SOJA, Edward W. </w:t>
-      </w:r>
-      <w:r>
-        <w:rPr>
-          <w:b w:val="1"/>
-          <w:bCs w:val="1"/>
-          <w:rtl w:val="0"/>
-        </w:rPr>
-        <w:t xml:space="preserve">Thirdspace</w:t>
-      </w:r>
-      <w:r>
-        <w:rPr>
-          <w:rtl w:val="0"/>
-        </w:rPr>
-        <w:t xml:space="preserve">: journeys to Los Angeles and other real-and-imagined places. Oxford: Blackwell, 1996.</w:t>
-      </w:r>
-    </w:p>
-    <w:p>
-      <w:pPr>
-        <w:spacing w:line="276" w:lineRule="auto"/>
-        <w:jc w:val="both"/>
-        <w:rPr/>
-      </w:pPr>
-      <w:r>
-        <w:rPr>
-          <w:rtl w:val="0"/>
-        </w:rPr>
-        <w:t xml:space="preserve"> </w:t>
-      </w:r>
-    </w:p>
-    <w:p>
-      <w:pPr>
-        <w:spacing w:line="276" w:lineRule="auto"/>
-        <w:jc w:val="both"/>
-        <w:rPr/>
-      </w:pPr>
-      <w:r>
-        <w:rPr>
-          <w:rtl w:val="0"/>
-        </w:rPr>
-        <w:t xml:space="preserve">THOMAS, James; HARDEN, Angela. Methods for the thematic synthesis of qualitative research in systematic reviews. </w:t>
-      </w:r>
-      <w:r>
-        <w:rPr>
-          <w:b w:val="1"/>
-          <w:bCs w:val="1"/>
-          <w:rtl w:val="0"/>
-        </w:rPr>
-        <w:t xml:space="preserve">BMC Medical Research Methodology</w:t>
-      </w:r>
-      <w:r>
-        <w:rPr>
-          <w:rtl w:val="0"/>
-        </w:rPr>
-        <w:t xml:space="preserve">, v. 8, art. 45, 2008. DOI: https://doi.org/10.1186/1471-2288-8-45.</w:t>
-      </w:r>
-    </w:p>
-    <w:p>
-      <w:pPr>
-        <w:spacing w:line="276" w:lineRule="auto"/>
-        <w:jc w:val="both"/>
-        <w:rPr/>
-      </w:pPr>
-      <w:r>
-        <w:rPr>
-          <w:rtl w:val="0"/>
-        </w:rPr>
-        <w:t xml:space="preserve"> </w:t>
-      </w:r>
-    </w:p>
-    <w:p>
-      <w:pPr>
-        <w:spacing w:line="276" w:lineRule="auto"/>
-        <w:jc w:val="both"/>
-        <w:rPr/>
-      </w:pPr>
+        <w:t xml:space="preserve">Tecnologias digitais no ciclo de alfabetização</w:t>
+      </w:r>
       <w:r>
         <w:rPr>
           <w:i w:val="1"/>
           <w:iCs w:val="1"/>
           <w:rtl w:val="0"/>
         </w:rPr>
-        <w:t xml:space="preserve">TUSSI, Graziela Bergonsi</w:t>
-      </w:r>
+        <w:t xml:space="preserve">: uma avaliação sobre a formação de professores na rede municipal de Fortaleza. 2024. Dissertação (Mestrado Profissional em Avaliação de Políticas Públicas) – Universidade Federal do Ceará, Fortaleza, 2024. Disponível em: http://repositorio.ufc.br/handle/riufc/77156. Acesso em: 15 set. 2026.</w:t>
+      </w:r>
+    </w:p>
+    <w:p>
+      <w:pPr>
+        <w:spacing w:line="276" w:lineRule="auto"/>
+        <w:jc w:val="left"/>
+        <w:rPr/>
+      </w:pPr>
+      <w:r>
+        <w:rPr>
+          <w:rtl w:val="0"/>
+        </w:rPr>
+        <w:t xml:space="preserve"> </w:t>
+      </w:r>
+    </w:p>
+    <w:p>
+      <w:pPr>
+        <w:spacing w:line="276" w:lineRule="auto"/>
+        <w:jc w:val="left"/>
+        <w:rPr/>
+      </w:pPr>
+      <w:r>
+        <w:rPr>
+          <w:rtl w:val="0"/>
+        </w:rPr>
+        <w:t xml:space="preserve">OCDE. </w:t>
+      </w:r>
+      <w:r>
+        <w:rPr>
+          <w:b/>
+          <w:rtl w:val="0"/>
+        </w:rPr>
+        <w:t xml:space="preserve">Digital Education Outlook 2023</w:t>
+      </w:r>
+      <w:r>
+        <w:rPr>
+          <w:rtl w:val="0"/>
+        </w:rPr>
+        <w:t xml:space="preserve">: towards an effective digital education ecosystem. Paris: OECD Publishing, 2023. DOI: https://doi.org/10.1787/c74f03de-en.</w:t>
+      </w:r>
+    </w:p>
+    <w:p>
+      <w:pPr>
+        <w:spacing w:line="276" w:lineRule="auto"/>
+        <w:jc w:val="left"/>
+        <w:rPr/>
+      </w:pPr>
+      <w:r>
+        <w:rPr>
+          <w:rtl w:val="0"/>
+        </w:rPr>
+        <w:t xml:space="preserve"> </w:t>
+      </w:r>
+    </w:p>
+    <w:p>
+      <w:pPr>
+        <w:spacing w:line="276" w:lineRule="auto"/>
+        <w:jc w:val="left"/>
+        <w:rPr/>
+      </w:pPr>
+      <w:r>
+        <w:rPr>
+          <w:rtl w:val="0"/>
+        </w:rPr>
+        <w:t xml:space="preserve">OKOLI, Chitu. Guia para realizar uma revisão sistemática da literatura. Tradução de David Wesley Amado Duarte; revisão técnica de João Mattar. </w:t>
+      </w:r>
+      <w:r>
+        <w:rPr>
+          <w:b/>
+          <w:rtl w:val="0"/>
+        </w:rPr>
+        <w:t xml:space="preserve">EaD em Foco</w:t>
+      </w:r>
+      <w:r>
+        <w:rPr>
+          <w:rtl w:val="0"/>
+        </w:rPr>
+        <w:t xml:space="preserve">, v. 9, n. 1, e748, 2019. DOI: https://doi.org/10.18264/eadf.v9i1.748.</w:t>
+      </w:r>
+    </w:p>
+    <w:p>
+      <w:pPr>
+        <w:spacing w:line="276" w:lineRule="auto"/>
+        <w:jc w:val="left"/>
+        <w:rPr/>
+      </w:pPr>
+      <w:r>
+        <w:rPr>
+          <w:rtl w:val="0"/>
+        </w:rPr>
+        <w:t xml:space="preserve"> </w:t>
+      </w:r>
+    </w:p>
+    <w:p>
+      <w:pPr>
+        <w:spacing w:line="276" w:lineRule="auto"/>
+        <w:jc w:val="left"/>
+        <w:rPr/>
+      </w:pPr>
+      <w:r>
+        <w:rPr>
+          <w:rtl w:val="0"/>
+        </w:rPr>
+        <w:t xml:space="preserve">OKOLI, Chitu; SCHABRAM, Kira. A guide to conducting a systematic literature review of information systems research. </w:t>
+      </w:r>
+      <w:r>
+        <w:rPr>
+          <w:b/>
+          <w:rtl w:val="0"/>
+        </w:rPr>
+        <w:t xml:space="preserve">Working Papers on Information Systems</w:t>
+      </w:r>
+      <w:r>
+        <w:rPr>
+          <w:rtl w:val="0"/>
+        </w:rPr>
+        <w:t xml:space="preserve">, v. 10, n. 26, 2010.</w:t>
+      </w:r>
+    </w:p>
+    <w:p>
+      <w:pPr>
+        <w:spacing w:line="276" w:lineRule="auto"/>
+        <w:jc w:val="left"/>
+        <w:rPr/>
+      </w:pPr>
+      <w:r>
+        <w:rPr>
+          <w:rtl w:val="0"/>
+        </w:rPr>
+        <w:t xml:space="preserve"> </w:t>
+      </w:r>
+    </w:p>
+    <w:p>
+      <w:pPr>
+        <w:spacing w:line="276" w:lineRule="auto"/>
+        <w:jc w:val="left"/>
+        <w:rPr/>
+      </w:pPr>
+      <w:r>
+        <w:rPr>
+          <w:rtl w:val="0"/>
+        </w:rPr>
+        <w:t xml:space="preserve">PAGE, Matthew J. et al. A declaração PRISMA 2020: diretriz atualizada para relatar revisões sistemáticas. </w:t>
+      </w:r>
+      <w:r>
+        <w:rPr>
+          <w:b/>
+          <w:rtl w:val="0"/>
+        </w:rPr>
+        <w:t xml:space="preserve">Epidemiologia e Serviços de Saúde</w:t>
+      </w:r>
+      <w:r>
+        <w:rPr>
+          <w:rtl w:val="0"/>
+        </w:rPr>
+        <w:t xml:space="preserve">, Brasília, v. 31, n. 2, e2022107, 2022. DOI: https://doi.org/10.1590/S1679-49742022000200033.</w:t>
+      </w:r>
+    </w:p>
+    <w:p>
+      <w:pPr>
+        <w:spacing w:line="276" w:lineRule="auto"/>
+        <w:jc w:val="left"/>
+        <w:rPr/>
+      </w:pPr>
+      <w:r>
+        <w:rPr>
+          <w:rtl w:val="0"/>
+        </w:rPr>
+        <w:t xml:space="preserve"> </w:t>
+      </w:r>
+    </w:p>
+    <w:p>
+      <w:pPr>
+        <w:spacing w:line="276" w:lineRule="auto"/>
+        <w:jc w:val="left"/>
+        <w:rPr/>
+      </w:pPr>
       <w:r>
         <w:rPr>
           <w:i w:val="1"/>
           <w:iCs w:val="1"/>
           <w:rtl w:val="0"/>
         </w:rPr>
-        <w:t xml:space="preserve">.</w:t>
-      </w:r>
-      <w:r>
-        <w:rPr>
-          <w:rtl w:val="0"/>
-        </w:rPr>
-        <w:t xml:space="preserve"> </w:t>
-      </w:r>
-      <w:r>
-        <w:rPr>
-          <w:b w:val="1"/>
-          <w:bCs w:val="1"/>
-          <w:rtl w:val="0"/>
-        </w:rPr>
-        <w:t xml:space="preserve">Caminhos metodológicos para a construção de uma política pública de computação no município de Passo Fundo – RS</w:t>
-      </w:r>
-      <w:r>
-        <w:rPr>
-          <w:rtl w:val="0"/>
-        </w:rPr>
-        <w:t xml:space="preserve">. 2023. Dissertação (Mestrado em Educação) – Universidade de Passo Fundo, Passo Fundo, 2023. Disponível em: https://repositorio.upf.br/handle/123456789/2308. Acesso em: 15 set. 2026.</w:t>
-      </w:r>
-    </w:p>
-    <w:p>
-      <w:pPr>
-        <w:spacing w:line="276" w:lineRule="auto"/>
-        <w:jc w:val="both"/>
-        <w:rPr/>
-      </w:pPr>
-      <w:r>
-        <w:rPr>
-          <w:rtl w:val="0"/>
-        </w:rPr>
-        <w:t xml:space="preserve"> </w:t>
-      </w:r>
-    </w:p>
-    <w:p>
-      <w:pPr>
-        <w:spacing w:line="276" w:lineRule="auto"/>
-        <w:jc w:val="both"/>
-        <w:rPr/>
-      </w:pPr>
-      <w:r>
-        <w:rPr>
-          <w:rtl w:val="0"/>
-        </w:rPr>
-        <w:t xml:space="preserve">UNESCO. </w:t>
-      </w:r>
-      <w:r>
-        <w:rPr>
-          <w:b w:val="1"/>
-          <w:bCs w:val="1"/>
-          <w:rtl w:val="0"/>
-        </w:rPr>
-        <w:t xml:space="preserve">Global education monitoring report 2023</w:t>
-      </w:r>
-      <w:r>
-        <w:rPr>
-          <w:rtl w:val="0"/>
-        </w:rPr>
-        <w:t xml:space="preserve">: technology in education: a tool on whose terms? Paris: UNESCO, 2023.</w:t>
-      </w:r>
-    </w:p>
-    <w:p>
-      <w:pPr>
-        <w:spacing w:line="276" w:lineRule="auto"/>
-        <w:jc w:val="both"/>
-        <w:rPr/>
-      </w:pPr>
-      <w:r>
-        <w:rPr>
-          <w:rtl w:val="0"/>
-        </w:rPr>
-        <w:t xml:space="preserve"> </w:t>
-      </w:r>
-    </w:p>
-    <w:p>
-      <w:pPr>
-        <w:spacing w:line="276" w:lineRule="auto"/>
-        <w:jc w:val="both"/>
-        <w:rPr/>
-      </w:pPr>
-      <w:r>
-        <w:rPr>
-          <w:rtl w:val="0"/>
-        </w:rPr>
-        <w:t xml:space="preserve">VENTISTA, Ourania Maria; KOLOKITHA, Magdalini; TSANI, Paraskevi; POLYDOROS, Georgios; ARKOUMANIS, Grigorios. Achieving digital education in primary schools: success factors and policy recommendations. </w:t>
-      </w:r>
-      <w:r>
-        <w:rPr>
-          <w:b w:val="1"/>
-          <w:bCs w:val="1"/>
-          <w:rtl w:val="0"/>
-        </w:rPr>
-        <w:t xml:space="preserve">Policy Futures in Education</w:t>
-      </w:r>
-      <w:r>
-        <w:rPr>
-          <w:rtl w:val="0"/>
-        </w:rPr>
-        <w:t xml:space="preserve">, v. 22, n. 8, 2024. DOI: https://doi.org/10.1177/14782103241238825.</w:t>
-      </w:r>
-    </w:p>
-    <w:p>
-      <w:pPr>
-        <w:spacing w:line="276" w:lineRule="auto"/>
-        <w:jc w:val="both"/>
-        <w:rPr/>
-      </w:pPr>
-      <w:r>
-        <w:rPr>
-          <w:rtl w:val="0"/>
-        </w:rPr>
-        <w:t xml:space="preserve"> </w:t>
-      </w:r>
-    </w:p>
-    <w:p>
-      <w:pPr>
-        <w:spacing w:line="276" w:lineRule="auto"/>
-        <w:jc w:val="both"/>
-        <w:rPr/>
-      </w:pPr>
-      <w:r>
-        <w:rPr>
+        <w:t xml:space="preserve">PAÑOS-CASTRO, Jessica; ARRUTI, Arantza; KORRES, Oihane. COVID and ICT in primary education: challenges faced by teachers in the Basque Country. </w:t>
+      </w:r>
+      <w:r>
+        <w:rPr>
+          <w:b/>
           <w:i w:val="1"/>
           <w:iCs w:val="1"/>
           <w:rtl w:val="0"/>
         </w:rPr>
-        <w:t xml:space="preserve">WILLIAMS, Kate Maloney</w:t>
+        <w:t xml:space="preserve">Sustainability</w:t>
       </w:r>
       <w:r>
         <w:rPr>
@@ -18884,24 +18578,490 @@
           <w:iCs w:val="1"/>
           <w:rtl w:val="0"/>
         </w:rPr>
-        <w:t xml:space="preserve">.</w:t>
-      </w:r>
-      <w:r>
-        <w:rPr>
-          <w:rtl w:val="0"/>
-        </w:rPr>
-        <w:t xml:space="preserve"> Exploring new literacies: a case study on technology and teacher development in Cuban primary schools. </w:t>
-      </w:r>
-      <w:r>
-        <w:rPr>
-          <w:b w:val="1"/>
-          <w:bCs w:val="1"/>
+        <w:t xml:space="preserve">, v. 14, n. 16, art. 10452, 2022. DOI: https://doi.org/10.3390/su141610452.</w:t>
+      </w:r>
+    </w:p>
+    <w:p>
+      <w:pPr>
+        <w:spacing w:line="276" w:lineRule="auto"/>
+        <w:jc w:val="left"/>
+        <w:rPr/>
+      </w:pPr>
+      <w:r>
+        <w:rPr>
+          <w:rtl w:val="0"/>
+        </w:rPr>
+        <w:t xml:space="preserve"> </w:t>
+      </w:r>
+    </w:p>
+    <w:p>
+      <w:pPr>
+        <w:spacing w:line="276" w:lineRule="auto"/>
+        <w:jc w:val="left"/>
+        <w:rPr/>
+      </w:pPr>
+      <w:r>
+        <w:rPr>
+          <w:i w:val="1"/>
+          <w:iCs w:val="1"/>
+          <w:rtl w:val="0"/>
+        </w:rPr>
+        <w:t xml:space="preserve">PEREIRA, Max Augusto Franco. </w:t>
+      </w:r>
+      <w:r>
+        <w:rPr>
+          <w:b/>
+          <w:i w:val="1"/>
+          <w:iCs w:val="1"/>
+          <w:rtl w:val="0"/>
+        </w:rPr>
+        <w:t xml:space="preserve">As políticas educacionais para inserção de tecnologias digitais no ensino fundamental em Aracaju</w:t>
+      </w:r>
+      <w:r>
+        <w:rPr>
+          <w:i w:val="1"/>
+          <w:iCs w:val="1"/>
+          <w:rtl w:val="0"/>
+        </w:rPr>
+        <w:t xml:space="preserve">: uma análise do processo discursivo dos contextos de influências. 2022. Tese (Doutorado em Educação) – Universidade Federal de Sergipe, São Cristóvão, 2022. Disponível em: http://ri.ufs.br/jspui/handle/riufs/16761. Acesso em: 15 set. 2026.</w:t>
+      </w:r>
+    </w:p>
+    <w:p>
+      <w:pPr>
+        <w:spacing w:line="276" w:lineRule="auto"/>
+        <w:jc w:val="left"/>
+        <w:rPr/>
+      </w:pPr>
+      <w:r>
+        <w:rPr>
+          <w:rtl w:val="0"/>
+        </w:rPr>
+        <w:t xml:space="preserve"> </w:t>
+      </w:r>
+    </w:p>
+    <w:p>
+      <w:pPr>
+        <w:spacing w:line="276" w:lineRule="auto"/>
+        <w:jc w:val="left"/>
+        <w:rPr/>
+      </w:pPr>
+      <w:r>
+        <w:rPr>
+          <w:rtl w:val="0"/>
+        </w:rPr>
+        <w:t xml:space="preserve">PRENSKY, Marc. Digital natives, digital immigrants. </w:t>
+      </w:r>
+      <w:r>
+        <w:rPr>
+          <w:b/>
+          <w:rtl w:val="0"/>
+        </w:rPr>
+        <w:t xml:space="preserve">On the Horizon</w:t>
+      </w:r>
+      <w:r>
+        <w:rPr>
+          <w:rtl w:val="0"/>
+        </w:rPr>
+        <w:t xml:space="preserve">, v. 9, n. 5, p. 1-6, 2001. DOI: https://doi.org/10.1108/10748120110424816.</w:t>
+      </w:r>
+    </w:p>
+    <w:p>
+      <w:pPr>
+        <w:spacing w:line="276" w:lineRule="auto"/>
+        <w:jc w:val="left"/>
+        <w:rPr/>
+      </w:pPr>
+      <w:r>
+        <w:rPr>
+          <w:rtl w:val="0"/>
+        </w:rPr>
+        <w:t xml:space="preserve"> </w:t>
+      </w:r>
+    </w:p>
+    <w:p>
+      <w:pPr>
+        <w:spacing w:line="276" w:lineRule="auto"/>
+        <w:jc w:val="left"/>
+        <w:rPr/>
+      </w:pPr>
+      <w:r>
+        <w:rPr>
+          <w:rtl w:val="0"/>
+        </w:rPr>
+        <w:t xml:space="preserve">QUEZADA-MORALES, Romina. The Provision of Learning in Mexico during the COVID-19 Pandemic: Defining the Digital Divide. </w:t>
+      </w:r>
+      <w:r>
+        <w:rPr>
+          <w:b/>
+          <w:rtl w:val="0"/>
+        </w:rPr>
+        <w:t xml:space="preserve">Current Issues in Comparative Education</w:t>
+      </w:r>
+      <w:r>
+        <w:rPr>
+          <w:rtl w:val="0"/>
+        </w:rPr>
+        <w:t xml:space="preserve">, Nova York, v. 24, n. 2, p. 204-216, 2022. DOI: https://doi.org/10.52214/cice.v24i2.9497.</w:t>
+      </w:r>
+    </w:p>
+    <w:p>
+      <w:pPr>
+        <w:spacing w:line="276" w:lineRule="auto"/>
+        <w:jc w:val="left"/>
+        <w:rPr/>
+      </w:pPr>
+      <w:r>
+        <w:rPr>
+          <w:rtl w:val="0"/>
+        </w:rPr>
+        <w:t xml:space="preserve"> </w:t>
+      </w:r>
+    </w:p>
+    <w:p>
+      <w:pPr>
+        <w:spacing w:line="276" w:lineRule="auto"/>
+        <w:jc w:val="left"/>
+        <w:rPr/>
+      </w:pPr>
+      <w:r>
+        <w:rPr>
+          <w:rtl w:val="0"/>
+        </w:rPr>
+        <w:t xml:space="preserve">ROJO, Roxane. Gêneros discursivos do Círculo de Bakhtin e multiletramentos. In: ROJO, Roxane (org.). </w:t>
+      </w:r>
+      <w:r>
+        <w:rPr>
+          <w:b/>
+          <w:rtl w:val="0"/>
+        </w:rPr>
+        <w:t xml:space="preserve">Escol@ conectada</w:t>
+      </w:r>
+      <w:r>
+        <w:rPr>
+          <w:rtl w:val="0"/>
+        </w:rPr>
+        <w:t xml:space="preserve">: os multiletramentos e as TICs. São Paulo: Parábola, 2013. p. 13-36.</w:t>
+      </w:r>
+    </w:p>
+    <w:p>
+      <w:pPr>
+        <w:spacing w:line="276" w:lineRule="auto"/>
+        <w:jc w:val="left"/>
+        <w:rPr/>
+      </w:pPr>
+      <w:r>
+        <w:rPr>
+          <w:rtl w:val="0"/>
+        </w:rPr>
+        <w:t xml:space="preserve"> </w:t>
+      </w:r>
+    </w:p>
+    <w:p>
+      <w:pPr>
+        <w:spacing w:line="276" w:lineRule="auto"/>
+        <w:jc w:val="left"/>
+        <w:rPr/>
+      </w:pPr>
+      <w:r>
+        <w:rPr>
+          <w:rtl w:val="0"/>
+        </w:rPr>
+        <w:t xml:space="preserve">SANTOS, Milton. O território e o saber local: algumas categorias de análise. </w:t>
+      </w:r>
+      <w:r>
+        <w:rPr>
+          <w:b/>
+          <w:rtl w:val="0"/>
+        </w:rPr>
+        <w:t xml:space="preserve">Cadernos IPPUR</w:t>
+      </w:r>
+      <w:r>
+        <w:rPr>
+          <w:rtl w:val="0"/>
+        </w:rPr>
+        <w:t xml:space="preserve">, Rio de Janeiro, ano 13, n. 2, p. 15-26, ago./dez. 1999.</w:t>
+      </w:r>
+    </w:p>
+    <w:p>
+      <w:pPr>
+        <w:spacing w:line="276" w:lineRule="auto"/>
+        <w:jc w:val="left"/>
+        <w:rPr/>
+      </w:pPr>
+      <w:r>
+        <w:rPr>
+          <w:rtl w:val="0"/>
+        </w:rPr>
+        <w:t xml:space="preserve"> </w:t>
+      </w:r>
+    </w:p>
+    <w:p>
+      <w:pPr>
+        <w:spacing w:line="276" w:lineRule="auto"/>
+        <w:jc w:val="left"/>
+        <w:rPr/>
+      </w:pPr>
+      <w:r>
+        <w:rPr>
+          <w:rtl w:val="0"/>
+        </w:rPr>
+        <w:t xml:space="preserve">SANTOS, Milton. </w:t>
+      </w:r>
+      <w:r>
+        <w:rPr>
+          <w:b/>
+          <w:rtl w:val="0"/>
+        </w:rPr>
+        <w:t xml:space="preserve">A natureza do espaço</w:t>
+      </w:r>
+      <w:r>
+        <w:rPr>
+          <w:rtl w:val="0"/>
+        </w:rPr>
+        <w:t xml:space="preserve">: técnica e tempo, razão e emoção. 4. ed. 2. reimpr. São Paulo: Editora da Universidade de São Paulo, 2006.</w:t>
+      </w:r>
+    </w:p>
+    <w:p>
+      <w:pPr>
+        <w:spacing w:line="276" w:lineRule="auto"/>
+        <w:jc w:val="left"/>
+        <w:rPr/>
+      </w:pPr>
+      <w:r>
+        <w:rPr>
+          <w:rtl w:val="0"/>
+        </w:rPr>
+        <w:t xml:space="preserve"> </w:t>
+      </w:r>
+    </w:p>
+    <w:p>
+      <w:pPr>
+        <w:spacing w:line="276" w:lineRule="auto"/>
+        <w:jc w:val="left"/>
+        <w:rPr/>
+      </w:pPr>
+      <w:r>
+        <w:rPr>
+          <w:rtl w:val="0"/>
+        </w:rPr>
+        <w:t xml:space="preserve">SOJA, Edward W. </w:t>
+      </w:r>
+      <w:r>
+        <w:rPr>
+          <w:b/>
+          <w:rtl w:val="0"/>
+        </w:rPr>
+        <w:t xml:space="preserve">Thirdspace</w:t>
+      </w:r>
+      <w:r>
+        <w:rPr>
+          <w:rtl w:val="0"/>
+        </w:rPr>
+        <w:t xml:space="preserve">: journeys to Los Angeles and other real-and-imagined places. Oxford: Blackwell, 1996.</w:t>
+      </w:r>
+    </w:p>
+    <w:p>
+      <w:pPr>
+        <w:spacing w:line="276" w:lineRule="auto"/>
+        <w:jc w:val="left"/>
+        <w:rPr/>
+      </w:pPr>
+      <w:r>
+        <w:rPr>
+          <w:rtl w:val="0"/>
+        </w:rPr>
+        <w:t xml:space="preserve"> </w:t>
+      </w:r>
+    </w:p>
+    <w:p>
+      <w:pPr>
+        <w:spacing w:line="276" w:lineRule="auto"/>
+        <w:jc w:val="left"/>
+        <w:rPr/>
+      </w:pPr>
+      <w:r>
+        <w:rPr>
+          <w:rtl w:val="0"/>
+        </w:rPr>
+        <w:t xml:space="preserve">THOMAS, James; HARDEN, Angela. Methods for the thematic synthesis of qualitative research in systematic reviews. </w:t>
+      </w:r>
+      <w:r>
+        <w:rPr>
+          <w:b/>
+          <w:rtl w:val="0"/>
+        </w:rPr>
+        <w:t xml:space="preserve">BMC Medical Research Methodology</w:t>
+      </w:r>
+      <w:r>
+        <w:rPr>
+          <w:rtl w:val="0"/>
+        </w:rPr>
+        <w:t xml:space="preserve">, v. 8, art. 45, 2008. DOI: https://doi.org/10.1186/1471-2288-8-45.</w:t>
+      </w:r>
+    </w:p>
+    <w:p>
+      <w:pPr>
+        <w:spacing w:line="276" w:lineRule="auto"/>
+        <w:jc w:val="left"/>
+        <w:rPr/>
+      </w:pPr>
+      <w:r>
+        <w:rPr>
+          <w:rtl w:val="0"/>
+        </w:rPr>
+        <w:t xml:space="preserve"> </w:t>
+      </w:r>
+    </w:p>
+    <w:p>
+      <w:pPr>
+        <w:spacing w:line="276" w:lineRule="auto"/>
+        <w:jc w:val="left"/>
+        <w:rPr/>
+      </w:pPr>
+      <w:r>
+        <w:rPr>
+          <w:i w:val="1"/>
+          <w:iCs w:val="1"/>
+          <w:rtl w:val="0"/>
+        </w:rPr>
+        <w:t xml:space="preserve">TUSSI, Graziela Bergonsi. </w:t>
+      </w:r>
+      <w:r>
+        <w:rPr>
+          <w:b/>
+          <w:i w:val="1"/>
+          <w:iCs w:val="1"/>
+          <w:rtl w:val="0"/>
+        </w:rPr>
+        <w:t xml:space="preserve">Caminhos metodológicos para a construção de uma política pública de computação no município de Passo Fundo – RS</w:t>
+      </w:r>
+      <w:r>
+        <w:rPr>
+          <w:i w:val="1"/>
+          <w:iCs w:val="1"/>
+          <w:rtl w:val="0"/>
+        </w:rPr>
+        <w:t xml:space="preserve">. 2023. Dissertação (Mestrado em Educação) – Universidade de Passo Fundo, Passo Fundo, 2023. Disponível em: https://repositorio.upf.br/handle/123456789/2308. Acesso em: 15 set. 2026.</w:t>
+      </w:r>
+    </w:p>
+    <w:p>
+      <w:pPr>
+        <w:spacing w:line="276" w:lineRule="auto"/>
+        <w:jc w:val="left"/>
+        <w:rPr/>
+      </w:pPr>
+      <w:r>
+        <w:rPr>
+          <w:rtl w:val="0"/>
+        </w:rPr>
+        <w:t xml:space="preserve"> </w:t>
+      </w:r>
+    </w:p>
+    <w:p>
+      <w:pPr>
+        <w:spacing w:line="276" w:lineRule="auto"/>
+        <w:jc w:val="left"/>
+        <w:rPr/>
+      </w:pPr>
+      <w:r>
+        <w:rPr>
+          <w:rtl w:val="0"/>
+        </w:rPr>
+        <w:t xml:space="preserve">UNESCO. </w:t>
+      </w:r>
+      <w:r>
+        <w:rPr>
+          <w:b/>
+          <w:rtl w:val="0"/>
+        </w:rPr>
+        <w:t xml:space="preserve">Global education monitoring report 2023</w:t>
+      </w:r>
+      <w:r>
+        <w:rPr>
+          <w:rtl w:val="0"/>
+        </w:rPr>
+        <w:t xml:space="preserve">: technology in education: a tool on whose terms? Paris: UNESCO, 2023.</w:t>
+      </w:r>
+    </w:p>
+    <w:p>
+      <w:pPr>
+        <w:spacing w:line="276" w:lineRule="auto"/>
+        <w:jc w:val="left"/>
+        <w:rPr/>
+      </w:pPr>
+      <w:r>
+        <w:rPr>
+          <w:rtl w:val="0"/>
+        </w:rPr>
+        <w:t xml:space="preserve"> </w:t>
+      </w:r>
+    </w:p>
+    <w:p>
+      <w:pPr>
+        <w:spacing w:line="276" w:lineRule="auto"/>
+        <w:jc w:val="left"/>
+        <w:rPr/>
+      </w:pPr>
+      <w:r>
+        <w:rPr>
+          <w:rtl w:val="0"/>
+        </w:rPr>
+        <w:t xml:space="preserve">VENTISTA, Ourania Maria; KOLOKITHA, Magdalini; TSANI, Paraskevi; POLYDOROS, Georgios; ARKOUMANIS, Grigorios. Achieving digital education in primary schools: success factors and policy recommendations. </w:t>
+      </w:r>
+      <w:r>
+        <w:rPr>
+          <w:b/>
+          <w:rtl w:val="0"/>
+        </w:rPr>
+        <w:t xml:space="preserve">Policy Futures in Education</w:t>
+      </w:r>
+      <w:r>
+        <w:rPr>
+          <w:rtl w:val="0"/>
+        </w:rPr>
+        <w:t xml:space="preserve">, v. 22, n. 8, 2024. DOI: https://doi.org/10.1177/14782103241238825.</w:t>
+      </w:r>
+    </w:p>
+    <w:p>
+      <w:pPr>
+        <w:spacing w:line="276" w:lineRule="auto"/>
+        <w:jc w:val="left"/>
+        <w:rPr/>
+      </w:pPr>
+      <w:r>
+        <w:rPr>
+          <w:rtl w:val="0"/>
+        </w:rPr>
+        <w:t xml:space="preserve"> </w:t>
+      </w:r>
+    </w:p>
+    <w:p>
+      <w:pPr>
+        <w:spacing w:line="276" w:lineRule="auto"/>
+        <w:jc w:val="left"/>
+        <w:rPr/>
+      </w:pPr>
+      <w:r>
+        <w:rPr>
+          <w:i w:val="1"/>
+          <w:iCs w:val="1"/>
+          <w:rtl w:val="0"/>
+        </w:rPr>
+        <w:t xml:space="preserve">WILLIAMS, Kate Maloney. Exploring new literacies: a case study on technology and teacher development in Cuban primary schools. </w:t>
+      </w:r>
+      <w:r>
+        <w:rPr>
+          <w:b/>
+          <w:i w:val="1"/>
+          <w:iCs w:val="1"/>
           <w:rtl w:val="0"/>
         </w:rPr>
         <w:t xml:space="preserve">Journal of Media Literacy Education</w:t>
       </w:r>
       <w:r>
         <w:rPr>
+          <w:i w:val="1"/>
+          <w:iCs w:val="1"/>
           <w:rtl w:val="0"/>
         </w:rPr>
         <w:t xml:space="preserve">, v. 14, n. 1, p. 82-93, 2022. DOI: https://doi.org/10.23860/jmle-2022-14-1-6.</w:t>

</xml_diff>

<commit_message>
Ajusta a RSL à escala municipal, sem alterar o protocolo
Lacunas e respostas da tese lidas da Secretaria à escola; nova linha
no Quadro 8 (variação territorial interna a uma rede); limitação sobre
a escala municipal, educação do campo e quilombola fora dos
descritores; contribuições, limites e articulação com o capítulo 6.

Co-Authored-By: Claude Opus 5.5 <noreply@anthropic.com>
Claude-Session: https://claude.ai/code/session_01HxStpW4pQoDfJdTDYr6zEC
</commit_message>
<xml_diff>
--- a/rsl_nova/2_RSL_alinhada_ao_projeto.docx
+++ b/rsl_nova/2_RSL_alinhada_ao_projeto.docx
@@ -117,7 +117,7 @@
         <w:rPr>
           <w:rtl w:val="0"/>
         </w:rPr>
-        <w:t>A Política Nacional de Educação Digital (PNED), instituída pela Lei nº 14.533, de 11 de janeiro de 2023, estabelece diretrizes e objetivos para a educação digital e a incorpora ao campo das políticas educacionais brasileiras. A existência de uma diretriz nacional, contudo, não permite presumir as condições de sua atuação nas escolas. Por isso, antes de olhar para uma escola concreta, buscamos neste capítulo o que a produção científica mostrou, entre 2019 e setembro de 2026, sobre a implementação de políticas públicas de educação digital nos anos iniciais do Ensino Fundamental, e também o que permaneceu pouco explorado. Era preciso conhecer o que a literatura já havia mostrado, tanto para não repetir perguntas já respondidas quanto para identificar aquelas ainda não formuladas. Na arquitetura da tese, a revisão cumpre duas funções: localiza a lacuna em que se inscrevem o objeto e o ineditismo apresentados na Introdução e oferece referências para os instrumentos do estudo de caso. Para isso, realizamos uma revisão sistemática da literatura (RSL), conduzida segundo protocolo próprio e orientada pela declaração PRISMA 2020 (PAGE et al., 2022), com a qual reunimos e avaliamos criticamente a produção científica nacional e internacional sobre o tema.</w:t>
+        <w:t>A Política Nacional de Educação Digital (PNED), instituída pela Lei nº 14.533, de 11 de janeiro de 2023, estabelece diretrizes e objetivos para a educação digital e a incorpora ao campo das políticas educacionais brasileiras. A existência de uma diretriz nacional, contudo, não permite presumir as condições de sua atuação nas escolas. Por isso, antes de acompanhar a política por uma rede municipal até uma de suas escolas, buscamos neste capítulo o que a produção científica mostrou, entre 2019 e setembro de 2026, sobre a implementação de políticas públicas de educação digital nos anos iniciais do Ensino Fundamental, e também o que permaneceu pouco explorado. Era preciso conhecer o que a literatura já havia mostrado, tanto para não repetir perguntas já respondidas quanto para identificar aquelas ainda não formuladas. Na arquitetura da tese, a revisão cumpre duas funções: localiza a lacuna em que se inscrevem o objeto e o ineditismo apresentados na Introdução e oferece referências para os instrumentos do estudo de caso. Para isso, realizamos uma revisão sistemática da literatura (RSL), conduzida segundo protocolo próprio e orientada pela declaração PRISMA 2020 (PAGE et al., 2022), com a qual reunimos e avaliamos criticamente a produção científica nacional e internacional sobre o tema.</w:t>
       </w:r>
     </w:p>
     <w:p>
@@ -13956,7 +13956,7 @@
         <w:rPr>
           <w:rtl w:val="0"/>
         </w:rPr>
-        <w:t xml:space="preserve">O território também comparece no corpus de modo restrito, como contraste entre países e regiões, sem variação interna a um mesmo sistema. Williams (2022) documenta uma restrição de escala nacional, imposta de fora do sistema educacional, e Paños-Castro, Arruti e Korres (2022) trabalham com uma comunidade autônoma dotada de programas próprios. Não encontramos estudo sobre as diferenças, dentro de um mesmo país, entre a capacidade de implementação de uma rede municipal de grande porte e a de um município pequeno. No Brasil, onde a educação básica se organiza em regime de colaboração entre entes com capacidades desiguais, essa ausência pesa na compreensão das condições territoriais de atuação das políticas de educação digital. A pesquisa TIC Educação (CETIC.br, 2024), referência externa ao corpus, dá a dimensão dessas diferenças entre escolas brasileiras. A leitura do território como dimensão constitutiva do contexto da prática, proposta nesta tese, não encontra apoio direto na literatura recuperada e vem de referenciais externos ao corpus. Santos (1999, p. 19) afirma que “o território não é uma categoria de análise, a categoria de análise é o território usado”, e Massey (2008, p. 29) compreende o espaço “como a esfera na qual distintas trajetórias coexistem”, formulações que permitem ler também as desigualdades internas a um mesmo distrito.</w:t>
+        <w:t>O território também comparece no corpus de modo restrito, como contraste entre países e regiões, sem variação interna a um mesmo sistema. Williams (2022) documenta uma restrição de escala nacional, imposta de fora do sistema educacional, e Paños-Castro, Arruti e Korres (2022) trabalham com uma comunidade autônoma dotada de programas próprios. Não encontramos estudo sobre as diferenças, dentro de um mesmo país, entre a capacidade de implementação de uma rede municipal de grande porte e a de um município pequeno. No Brasil, onde a educação básica se organiza em regime de colaboração entre entes com capacidades desiguais, essa ausência pesa na compreensão das condições territoriais de atuação das políticas de educação digital. A pesquisa TIC Educação (CETIC.br, 2024), referência externa ao corpus, dá a dimensão dessas diferenças entre escolas brasileiras. A leitura do território como dimensão constitutiva do contexto da prática, proposta nesta tese, não encontra apoio direto na literatura recuperada e vem de referenciais externos ao corpus. Santos (1999, p. 19) afirma que “o território não é uma categoria de análise, a categoria de análise é o território usado”, e Massey (2008, p. 29) compreende o espaço “como a esfera na qual distintas trajetórias coexistem”, formulações que permitem ler também as desigualdades internas a um mesmo município. Em Tibau do Sul, essa variação interna separa a sede, Pipa, os povoados rurais e a comunidade quilombola de Sibaúma, e uma mesma orientação nacional chega, pela Secretaria Municipal de Educação, a escolas situadas nesses lugares.</w:t>
       </w:r>
     </w:p>
     <w:p>
@@ -14067,7 +14067,7 @@
         <w:rPr>
           <w:rtl w:val="0"/>
         </w:rPr>
-        <w:t>As funções de gestão recebem tratamento igualmente limitado. Três estudos do corpus incluem diretores ou dirigentes entre os sujeitos ouvidos, mas nenhum trata a posição de gestão como mediadora da relação entre a diretriz e a prática de sala de aula. Os gestores comparecem como informantes sobre a política, ao lado dos professores regentes, sem exame de sua função institucional como fonte de uma leitura própria da norma. Os estudos registram o relato do gestor sobre a chegada da política à escola e quase nada perguntam sobre o modo como ele a leu. Nesta tese, ouvimos profissionais em funções diversas na mesma escola, além de um técnico da Secretaria Municipal de Educação, e precisamos distinguir os efeitos da posição institucional sobre essa leitura.</w:t>
+        <w:t>As funções de gestão recebem tratamento igualmente limitado. Três estudos do corpus incluem diretores ou dirigentes entre os sujeitos ouvidos, mas nenhum trata a posição de gestão como mediadora da relação entre a diretriz e a prática de sala de aula. Os gestores comparecem como informantes sobre a política, ao lado dos professores regentes, sem exame de sua função institucional como fonte de uma leitura própria da norma. Os estudos registram o relato do gestor sobre a chegada da política à escola e quase nada perguntam sobre o modo como ele a leu. Nesta tese, a investigação começa pela Secretaria Municipal de Educação, com a leitura dos documentos da rede e a entrevista com um técnico, e chega à escola, onde ouvimos profissionais em funções diversas. Precisamos, por isso, distinguir a leitura da norma feita pela gestão municipal daquela feita na escola e os efeitos de cada posição institucional sobre ela.</w:t>
       </w:r>
     </w:p>
     <w:p>
@@ -14296,7 +14296,7 @@
         <w:rPr>
           <w:rtl w:val="0"/>
         </w:rPr>
-        <w:t xml:space="preserve">Aracaju e Fortaleza são capitais, e Passo Fundo, cidade de porte médio. Nos três casos, a formação e a organização das equipes dependem de decisões locais. Nenhum deles examina uma rede de pequeno porte nem toma como objeto o financiamento das condições descritas, ponto retomado pelo Capítulo 5 na análise das fontes de recursos da PNED. Permanece em aberto o destino dessas condições numa rede como a de Tibau do Sul (RN), e a revisão não permite antecipar a resposta.</w:t>
+        <w:t>Aracaju e Fortaleza são capitais, e Passo Fundo, cidade de porte médio. Nos três casos, a formação e a organização das equipes dependem de decisões locais. Nenhum deles examina uma rede de pequeno porte, compara as escolas de uma mesma rede situadas em localidades diferentes ou toma como objeto o financiamento das condições descritas, ponto retomado pelo Capítulo 5 na análise das fontes de recursos da PNED. Permanece em aberto o destino dessas condições numa rede como a de Tibau do Sul (RN), e a revisão não permite antecipar a resposta.</w:t>
       </w:r>
     </w:p>
     <w:p>
@@ -15428,7 +15428,7 @@
         <w:rPr>
           <w:rtl w:val="0"/>
         </w:rPr>
-        <w:t xml:space="preserve">O corpus oferece, por isso, poucos elementos para esta tese, que investiga uma rede municipal de pequeno porte e toma o território como parte do contexto da prática, junto com as condições institucionais e materiais da escola.</w:t>
+        <w:t>O corpus oferece, por isso, poucos elementos para esta tese, que acompanha a política por uma rede municipal de pequeno porte, da Secretaria à escola, e toma o território municipal como parte do contexto, junto com as condições institucionais e materiais da rede e da escola.</w:t>
       </w:r>
     </w:p>
     <w:p>
@@ -15525,7 +15525,7 @@
         <w:rPr>
           <w:rtl w:val="0"/>
         </w:rPr>
-        <w:t>Nenhum dos nove estudos incluídos examina a PNED. A política comparece em trabalhos brasileiros recuperados pela busca, mas esses estudos não atenderam aos critérios de nível de ensino ou de objeto e integram, por isso, a literatura de contextualização. A ausência tem explicação cronológica. A lei foi promulgada em janeiro de 2023. A educação digital passou a integrar o currículo do ensino fundamental pelo § 11 do art. 26 da LDB, incluído pela própria Lei nº 14.533/2023 e promulgado em dezembro de 2023, após a derrubada do veto. A Resolução CNE/CEB nº 2/2025, por fim, tornou obrigatória a implementação curricular a partir de 2026 (BRASIL, 2025, art. 36). Com as buscas encerradas em setembro de 2026, era esperado que a produção disponível não contivesse exames empíricos da atuação do eixo Educação Digital Escolar nas escolas, pois essa atuação apenas começava. A lacuna da literatura acompanha, nesse ponto, o calendário da política. É aqui que se situa a dimensão empírico-temporal do ineditismo desta tese, que decorre da novidade da norma e de um recorte fora do alcance do corpus, os anos iniciais de uma escola de rede municipal de pequeno porte.</w:t>
+        <w:t>Nenhum dos nove estudos incluídos examina a PNED. A política comparece em trabalhos brasileiros recuperados pela busca, mas esses estudos não atenderam aos critérios de nível de ensino ou de objeto e integram, por isso, a literatura de contextualização. A ausência tem explicação cronológica. A lei foi promulgada em janeiro de 2023. A educação digital passou a integrar o currículo do ensino fundamental pelo § 11 do art. 26 da LDB, incluído pela própria Lei nº 14.533/2023 e promulgado em dezembro de 2023, após a derrubada do veto. A Resolução CNE/CEB nº 2/2025, por fim, tornou obrigatória a implementação curricular a partir de 2026 (BRASIL, 2025, art. 36). Com as buscas encerradas em setembro de 2026, era esperado que a produção disponível não contivesse exames empíricos da atuação do eixo Educação Digital Escolar nas escolas, pois essa atuação apenas começava. A lacuna da literatura acompanha, nesse ponto, o calendário da política. É aqui que se situa a dimensão empírico-temporal do ineditismo desta tese, que decorre da novidade da norma e de um recorte fora do alcance do corpus, os anos iniciais de uma escola de rede municipal de pequeno porte, acompanhados desde a Secretaria Municipal de Educação.</w:t>
       </w:r>
     </w:p>
     <w:p>
@@ -15635,7 +15635,7 @@
         <w:rPr>
           <w:rtl w:val="0"/>
         </w:rPr>
-        <w:t xml:space="preserve">Três lacunas adicionais completam o quadro. A ausência de desenhos longitudinais impede avaliar se as práticas documentadas se sustentam ao longo do tempo, pois todos os estudos do corpus registram um único momento. Os três estudos brasileiros situam-se em duas capitais e numa cidade de porte médio, e nenhum examina uma rede municipal de pequeno porte com características territoriais semelhantes às do contexto investigado. A ausência de problematização das plataformas privadas e da extração de dados escolares, por fim, deixa pouco explorado o modo como esses recursos se expandem nas escolas.</w:t>
+        <w:t>Três lacunas adicionais completam o quadro. A ausência de desenhos longitudinais impede avaliar se as práticas documentadas se sustentam ao longo do tempo, pois todos os estudos do corpus registram um único momento. Os três estudos brasileiros situam-se em duas capitais e numa cidade de porte médio, e nenhum examina uma rede municipal de pequeno porte com características territoriais semelhantes às do contexto investigado nem o modo como uma rede traduz a política para escolas situadas em localidades diferentes entre si. A ausência de problematização das plataformas privadas e da extração de dados escolares, por fim, deixa pouco explorado o modo como esses recursos se expandem nas escolas.</w:t>
       </w:r>
     </w:p>
     <w:p>
@@ -16752,7 +16752,154 @@
                 <w:szCs w:val="20"/>
                 <w:rtl w:val="0"/>
               </w:rPr>
-              <w:t xml:space="preserve">Investiga uma rede municipal de pequeno porte, em Tibau do Sul (RN).</w:t>
+              <w:t>Acompanha a PNED pela rede municipal de Tibau do Sul (RN), da Secretaria Municipal de Educação à escola de Pipa.</w:t>
+            </w:r>
+          </w:p>
+        </w:tc>
+      </w:tr>
+      <w:tr>
+        <w:trPr>
+          <w:cantSplit w:val="0"/>
+          <w:trHeight w:val="630" w:hRule="atLeast"/>
+          <w:tblHeader w:val="0"/>
+        </w:trPr>
+        <w:tc>
+          <w:tcPr>
+            <w:tcBorders>
+              <w:top w:color="000000" w:space="0" w:sz="0" w:val="nil"/>
+              <w:left w:color="000000" w:space="0" w:sz="5" w:val="single"/>
+              <w:bottom w:color="000000" w:space="0" w:sz="5" w:val="single"/>
+              <w:right w:color="000000" w:space="0" w:sz="5" w:val="single"/>
+            </w:tcBorders>
+            <w:tcMar>
+              <w:top w:w="60.0" w:type="dxa"/>
+              <w:left w:w="80.0" w:type="dxa"/>
+              <w:bottom w:w="60.0" w:type="dxa"/>
+              <w:right w:w="80.0" w:type="dxa"/>
+            </w:tcMar>
+            <w:vAlign w:val="top"/>
+          </w:tcPr>
+          <w:p>
+            <w:pPr>
+              <w:spacing w:line="240" w:lineRule="auto"/>
+              <w:jc w:val="center"/>
+              <w:rPr>
+                <w:sz w:val="20"/>
+                <w:szCs w:val="20"/>
+              </w:rPr>
+            </w:pPr>
+            <w:r>
+              <w:rPr>
+                <w:sz w:val="20"/>
+                <w:szCs w:val="20"/>
+                <w:rtl w:val="0"/>
+              </w:rPr>
+              <w:t>Variação territorial interna a uma rede não examinada</w:t>
+            </w:r>
+          </w:p>
+        </w:tc>
+        <w:tc>
+          <w:tcPr>
+            <w:tcBorders>
+              <w:top w:color="000000" w:space="0" w:sz="0" w:val="nil"/>
+              <w:left w:color="000000" w:space="0" w:sz="0" w:val="nil"/>
+              <w:bottom w:color="000000" w:space="0" w:sz="5" w:val="single"/>
+              <w:right w:color="000000" w:space="0" w:sz="5" w:val="single"/>
+            </w:tcBorders>
+            <w:tcMar>
+              <w:top w:w="60.0" w:type="dxa"/>
+              <w:left w:w="80.0" w:type="dxa"/>
+              <w:bottom w:w="60.0" w:type="dxa"/>
+              <w:right w:w="80.0" w:type="dxa"/>
+            </w:tcMar>
+            <w:vAlign w:val="top"/>
+          </w:tcPr>
+          <w:p>
+            <w:pPr>
+              <w:spacing w:line="240" w:lineRule="auto"/>
+              <w:jc w:val="center"/>
+              <w:rPr>
+                <w:sz w:val="20"/>
+                <w:szCs w:val="20"/>
+              </w:rPr>
+            </w:pPr>
+            <w:r>
+              <w:rPr>
+                <w:sz w:val="20"/>
+                <w:szCs w:val="20"/>
+                <w:rtl w:val="0"/>
+              </w:rPr>
+              <w:t>O corpus trata o território como contraste entre países e regiões; nenhum estudo examina diferenças entre localidades de um mesmo município (seção 2.4.1).</w:t>
+            </w:r>
+          </w:p>
+        </w:tc>
+        <w:tc>
+          <w:tcPr>
+            <w:tcBorders>
+              <w:top w:color="000000" w:space="0" w:sz="0" w:val="nil"/>
+              <w:left w:color="000000" w:space="0" w:sz="0" w:val="nil"/>
+              <w:bottom w:color="000000" w:space="0" w:sz="5" w:val="single"/>
+              <w:right w:color="000000" w:space="0" w:sz="5" w:val="single"/>
+            </w:tcBorders>
+            <w:tcMar>
+              <w:top w:w="60.0" w:type="dxa"/>
+              <w:left w:w="80.0" w:type="dxa"/>
+              <w:bottom w:w="60.0" w:type="dxa"/>
+              <w:right w:w="80.0" w:type="dxa"/>
+            </w:tcMar>
+            <w:vAlign w:val="top"/>
+          </w:tcPr>
+          <w:p>
+            <w:pPr>
+              <w:spacing w:line="240" w:lineRule="auto"/>
+              <w:jc w:val="center"/>
+              <w:rPr>
+                <w:sz w:val="20"/>
+                <w:szCs w:val="20"/>
+              </w:rPr>
+            </w:pPr>
+            <w:r>
+              <w:rPr>
+                <w:sz w:val="20"/>
+                <w:szCs w:val="20"/>
+                <w:rtl w:val="0"/>
+              </w:rPr>
+              <w:t>Não se sabe como uma rede municipal traduz uma política nacional para escolas situadas em realidades distintas.</w:t>
+            </w:r>
+          </w:p>
+        </w:tc>
+        <w:tc>
+          <w:tcPr>
+            <w:tcBorders>
+              <w:top w:color="000000" w:space="0" w:sz="0" w:val="nil"/>
+              <w:left w:color="000000" w:space="0" w:sz="0" w:val="nil"/>
+              <w:bottom w:color="000000" w:space="0" w:sz="5" w:val="single"/>
+              <w:right w:color="000000" w:space="0" w:sz="5" w:val="single"/>
+            </w:tcBorders>
+            <w:tcMar>
+              <w:top w:w="60.0" w:type="dxa"/>
+              <w:left w:w="80.0" w:type="dxa"/>
+              <w:bottom w:w="60.0" w:type="dxa"/>
+              <w:right w:w="80.0" w:type="dxa"/>
+            </w:tcMar>
+            <w:vAlign w:val="top"/>
+          </w:tcPr>
+          <w:p>
+            <w:pPr>
+              <w:spacing w:line="240" w:lineRule="auto"/>
+              <w:jc w:val="center"/>
+              <w:rPr>
+                <w:sz w:val="20"/>
+                <w:szCs w:val="20"/>
+              </w:rPr>
+            </w:pPr>
+            <w:r>
+              <w:rPr>
+                <w:sz w:val="20"/>
+                <w:szCs w:val="20"/>
+                <w:rtl w:val="0"/>
+              </w:rPr>
+              <w:t>Lê o território municipal e examina, nos documentos da rede e na entrevista com o técnico da Secretaria, se e como a tradução municipal da PNED considera as especificidades das localidades, das áreas rurais à comunidade quilombola de Sibaúma.</w:t>
             </w:r>
           </w:p>
         </w:tc>
@@ -17229,6 +17376,20 @@
         <w:rPr>
           <w:rtl w:val="0"/>
         </w:rPr>
+        <w:t>A revisão foi concluída antes de a investigação adotar a escala municipal como ponto de partida. Os descritores não incluem a educação do campo nem a educação escolar quilombola, e a estratégia não buscou estudos sobre secretarias municipais de educação como instâncias de tradução da política. Estudos sobre essas modalidades e sobre a gestão municipal entram na tese como literatura de contextualização, nos Capítulos 3 e 6, sem integrar o corpus e sem alterar o protocolo aqui relatado.</w:t>
+      </w:r>
+    </w:p>
+    <w:p>
+      <w:pPr>
+        <w:spacing w:after="0" w:before="0" w:lineRule="auto"/>
+        <w:ind w:firstLine="700"/>
+        <w:jc w:val="both"/>
+        <w:rPr/>
+      </w:pPr>
+      <w:r>
+        <w:rPr>
+          <w:rtl w:val="0"/>
+        </w:rPr>
       </w:r>
     </w:p>
     <w:p>
@@ -17282,7 +17443,7 @@
         <w:rPr>
           <w:rtl w:val="0"/>
         </w:rPr>
-        <w:t>A revisão permite situar a contribuição da tese nas três dimensões de ineditismo apresentadas na Introdução. A dimensão empírico-temporal decorre de três condições ausentes do corpus: a PNED como objeto, examinável apenas depois de 2023 e com a exigência curricular obrigatória a partir de 2026; o recorte dos anos iniciais, do 1º ao 5º ano, com escuta de todos os profissionais da educação da escola; e uma rede municipal de pequeno porte, em Tibau do Sul (RN). A dimensão analítico-espacial responde ao modo restrito como o corpus trata o território, sempre como contraste entre países e regiões. Os estudos brasileiros, situados em duas capitais e numa cidade de porte médio, não alcançam as características de um distrito como Pipa, onde a densidade tecnológica dos circuitos turísticos convive com uma escola de poucos recursos digitais, e a tese toma esse território como parte constitutiva do contexto da prática.</w:t>
+        <w:t>A revisão permite situar a contribuição da tese nas três dimensões de ineditismo apresentadas na Introdução. A dimensão empírico-temporal decorre de três condições ausentes do corpus: a PNED como objeto, examinável apenas depois de 2023 e com a exigência curricular obrigatória a partir de 2026; o recorte dos anos iniciais, do 1º ao 5º ano, com escuta de todos os profissionais da educação da escola; e uma rede municipal de pequeno porte, em Tibau do Sul (RN). A dimensão analítico-espacial responde ao modo restrito como o corpus trata o território, sempre como contraste entre países e regiões. Os estudos brasileiros, situados em duas capitais e numa cidade de porte médio, não alcançam as características de um município como Tibau do Sul, que reúne a sede, povoados rurais, uma comunidade quilombola e Pipa, onde a densidade tecnológica dos circuitos turísticos convive com uma escola de poucos recursos digitais. A tese toma esse território municipal como parte constitutiva do contexto e acompanha a política por ele, da Secretaria à escola.</w:t>
       </w:r>
     </w:p>
     <w:p>
@@ -17296,7 +17457,7 @@
         <w:rPr>
           <w:rtl w:val="0"/>
         </w:rPr>
-        <w:t xml:space="preserve">A dimensão teórico-conceitual está na leitura conjunta dessas condições. Tratamos a implementação como processo relacional, reunindo o normativo, o institucional, o territorial e o formativo, costumeiramente examinados em separado pela literatura. Os referenciais que permitem essa leitura são externos ao corpus. A Abordagem do Ciclo de Políticas (BOWE; BALL; GOLD, 1992; MAINARDES, 2006) e a teoria da atuação (BALL; MAGUIRE; BRAUN, 2016) oferecem as ferramentas para ler a política no contexto da prática; a discussão de Hargreaves (2005) sobre culturas profissionais e a de Ball (2004, 2008) sobre performatividade permitem examinar o que filtra e o que pressiona a atuação; e as leituras de território de Santos (1999, 2006) e de Massey (2008) inscrevem Pipa na análise. O corpus contém estudos sobre infraestrutura, formação, políticas e atuação profissional, quase sempre examinados de maneira isolada, e permanece menos explorada a relação entre essas dimensões quando uma política nacional chega a uma rede municipal e é encenada em uma escola situada em condições territoriais e institucionais específicas. Nesse ponto está o problema empírico desta tese, que diz respeito ao modo como as orientações da PNED assumem sentidos e formas de atuação ao atravessar condições materiais, institucionais e territoriais específicas e encontrar profissionais da educação que, com suas culturas profissionais, tomam decisões situadas no cotidiano escolar.</w:t>
+        <w:t>A dimensão teórico-conceitual está na leitura conjunta dessas condições. Tratamos a implementação como processo relacional, reunindo o normativo, o institucional, o territorial e o formativo, costumeiramente examinados em separado pela literatura. Os referenciais que permitem essa leitura são externos ao corpus. A Abordagem do Ciclo de Políticas (BOWE; BALL; GOLD, 1992; MAINARDES, 2006) e a teoria da atuação (BALL; MAGUIRE; BRAUN, 2016) oferecem as ferramentas para ler a política no contexto da prática; a discussão de Hargreaves (2005) sobre culturas profissionais e a de Ball (2004, 2008) sobre performatividade permitem examinar o que filtra e o que pressiona a atuação; e as leituras de território de Santos (1999, 2006) e de Massey (2008) inscrevem o município e Pipa na análise. O corpus contém estudos sobre infraestrutura, formação, políticas e atuação profissional, quase sempre examinados de maneira isolada, e permanece menos explorada a relação entre essas dimensões quando uma política nacional chega a uma rede municipal e é encenada em uma escola situada em condições territoriais e institucionais específicas. Nesse ponto está o problema empírico desta tese, que diz respeito ao modo como as orientações da PNED assumem sentidos e formas de atuação ao atravessar condições materiais, institucionais e territoriais específicas e encontrar profissionais da educação que, com suas culturas profissionais, tomam decisões situadas no cotidiano escolar.</w:t>
       </w:r>
     </w:p>
     <w:p>
@@ -17324,7 +17485,7 @@
         <w:rPr>
           <w:rtl w:val="0"/>
         </w:rPr>
-        <w:t>Declaramos, também, os limites da proposta. A investigação examina os mediadores do processo, os profissionais da educação e as condições de sua atuação. Os efeitos sobre o desenvolvimento das crianças, ausentes da literatura segundo a revisão, exigem desenhos de outro escopo e de outra duração e permanecem fora do alcance desta tese. A investigação procura mostrar que formas de atuação os profissionais produzem diante do que a política pede, da adesão à resistência, que custo o desenho da política lhes transfere e que implicações essas formas têm para a provisão, a proteção e a participação das crianças no ambiente digital.</w:t>
+        <w:t>Declaramos, também, os limites da proposta. A investigação examina os mediadores do processo, a Secretaria Municipal de Educação e os profissionais da escola, e as condições de sua atuação. Os efeitos sobre o desenvolvimento das crianças, ausentes da literatura segundo a revisão, exigem desenhos de outro escopo e de outra duração e permanecem fora do alcance desta tese. A investigação procura mostrar que formas de atuação os profissionais produzem diante do que a política pede, da adesão à resistência, que custo o desenho da política lhes transfere e que implicações essas formas têm para a provisão, a proteção e a participação das crianças no ambiente digital.</w:t>
       </w:r>
     </w:p>
     <w:p>
@@ -17366,7 +17527,7 @@
         <w:rPr>
           <w:rtl w:val="0"/>
         </w:rPr>
-        <w:t xml:space="preserve">Os capítulos seguintes retomam essas lacunas. No Capítulo 3, apresentamos os fundamentos teóricos: a Abordagem do Ciclo de Políticas, a teoria da atuação, as culturas profissionais, a performatividade, a leitura foucaultiana do poder e a noção de habitar o digital, com as plataformas e os dados das crianças como contexto. No Capítulo 4, apresentamos o desenho metodológico da investigação de campo e os critérios de leitura das formas de atuação. O Capítulo 5 examina a produção do texto da política e reconstrói o percurso até a PNED e seu eixo Educação Digital Escolar. No Capítulo 6, deslocamos o olhar para o território e para as condições institucionais e materiais da escola, onde a política encontra o contexto da prática. Por fim, no Capítulo 7, analisamos as narrativas dos profissionais da educação, seus modos de interpretar e traduzir a política, as formas de atuação que produzem diante dela e os sentidos que atribuem à educação digital e à formação cidadã.</w:t>
+        <w:t>Os capítulos seguintes retomam essas lacunas. No Capítulo 3, apresentamos os fundamentos teóricos: a Abordagem do Ciclo de Políticas, a teoria da atuação, as culturas profissionais, a performatividade, a leitura foucaultiana do poder e a noção de habitar o digital, com as plataformas e os dados das crianças como contexto. No Capítulo 4, apresentamos o desenho metodológico da investigação de campo e os critérios de leitura das formas de atuação. O Capítulo 5 examina a produção do texto da política e reconstrói o percurso até a PNED e seu eixo Educação Digital Escolar. No Capítulo 6, percorremos o território do município à escola: as localidades de Tibau do Sul, a rede municipal e a Secretaria de Educação diante da PNED e as condições institucionais e materiais da escola de Pipa, onde a política encontra o contexto da prática. Por fim, no Capítulo 7, analisamos as narrativas dos profissionais da educação, seus modos de interpretar e traduzir a política, as formas de atuação que produzem diante dela e os sentidos que atribuem à educação digital e à formação cidadã.</w:t>
       </w:r>
     </w:p>
     <w:p>
@@ -17380,7 +17541,7 @@
         <w:rPr>
           <w:rtl w:val="0"/>
         </w:rPr>
-        <w:t>A RSL permitiu, assim, situar o estado da produção sobre políticas públicas de educação digital nos anos iniciais e delimitar o problema empírico desta tese. O corpus final, composto por nove estudos, evidencia condições de atuação da política para além da disponibilidade de recursos e reconhece a participação dos profissionais da educação na interpretação e na atuação das políticas. Revela, ainda, uma produção restrita sobre o ciclo de alfabetização, sobre redes municipais de pequeno porte e sobre a implementação da PNED nos anos iniciais, recente demais para já ter sido examinada. Os sentidos de cultura digital e de formação cidadã permanecem pouco explorados, o que justifica sua investigação a partir das compreensões dos profissionais da educação. A presente pesquisa se inscreve nesse conjunto de lacunas ao perguntar como os profissionais da educação encenam e recontextualizam a PNED no contexto da prática de uma escola pública municipal dos anos iniciais e como as culturas profissionais, as condições materiais e institucionais da escola e as especificidades do território atravessam esse processo. Dos nove estudos, a revisão retira a constatação de que o equipamento é insuficiente sem formação e sem tempo de trabalho, e deixa em aberto o que fazem os profissionais quando nem o equipamento chega. A resposta a essa pergunta depende da escuta dos profissionais da educação que lidam com essa situação nos anos iniciais da escola de Pipa.</w:t>
+        <w:t>A RSL permitiu, assim, situar o estado da produção sobre políticas públicas de educação digital nos anos iniciais e delimitar o problema empírico desta tese. O corpus final, composto por nove estudos, evidencia condições de atuação da política para além da disponibilidade de recursos e reconhece a participação dos profissionais da educação na interpretação e na atuação das políticas. Revela, ainda, uma produção restrita sobre o ciclo de alfabetização, sobre redes municipais de pequeno porte e sobre a implementação da PNED nos anos iniciais, recente demais para já ter sido examinada. Os sentidos de cultura digital e de formação cidadã permanecem pouco explorados, o que justifica sua investigação a partir das compreensões dos profissionais da educação. A presente pesquisa se inscreve nesse conjunto de lacunas ao perguntar como a PNED é recontextualizada pela Secretaria Municipal de Educação de um município de pequeno porte e diverso e como essa recontextualização chega a uma escola pública municipal dos anos iniciais, onde os profissionais da educação a encenam, atravessados pelas culturas profissionais, pelas condições materiais e institucionais da escola e pelas especificidades do território. Dos nove estudos, a revisão retira a constatação de que o equipamento é insuficiente sem formação e sem tempo de trabalho, e deixa em aberto o que fazem os profissionais quando nem o equipamento chega. A resposta a essa pergunta depende da escuta dos profissionais da educação que lidam com essa situação nos anos iniciais da escola de Pipa.</w:t>
       </w:r>
     </w:p>
     <w:p>

</xml_diff>